<commit_message>
Assignment 3 Part 4 finished
</commit_message>
<xml_diff>
--- a/Assignment 3/Lab_report_3.docx
+++ b/Assignment 3/Lab_report_3.docx
@@ -35,7 +35,7 @@
                     </pic:cNvPicPr>
                   </pic:nvPicPr>
                   <pic:blipFill>
-                    <a:blip r:embed="rId7">
+                    <a:blip r:embed="rId8">
                       <a:extLst>
                         <a:ext uri="{28A0092B-C50C-407E-A947-70E740481C1C}">
                           <a14:useLocalDpi xmlns:a14="http://schemas.microsoft.com/office/drawing/2010/main" val="0"/>
@@ -388,9 +388,8 @@
           <w:sz w:val="28"/>
           <w:szCs w:val="28"/>
         </w:rPr>
-        <w:t xml:space="preserve">Sampling, </w:t>
-      </w:r>
-      <w:proofErr w:type="spellStart"/>
+        <w:t>Sampling, Quanti</w:t>
+      </w:r>
       <w:r>
         <w:rPr>
           <w:rFonts w:cs="Arial"/>
@@ -399,7 +398,7 @@
           <w:sz w:val="28"/>
           <w:szCs w:val="28"/>
         </w:rPr>
-        <w:t>Quanti</w:t>
+        <w:t>s</w:t>
       </w:r>
       <w:r>
         <w:rPr>
@@ -409,28 +408,7 @@
           <w:sz w:val="28"/>
           <w:szCs w:val="28"/>
         </w:rPr>
-        <w:t>s</w:t>
-      </w:r>
-      <w:r>
-        <w:rPr>
-          <w:rFonts w:cs="Arial"/>
-          <w:b/>
-          <w:bCs/>
-          <w:sz w:val="28"/>
-          <w:szCs w:val="28"/>
-        </w:rPr>
-        <w:t>ation</w:t>
-      </w:r>
-      <w:proofErr w:type="spellEnd"/>
-      <w:r>
-        <w:rPr>
-          <w:rFonts w:cs="Arial"/>
-          <w:b/>
-          <w:bCs/>
-          <w:sz w:val="28"/>
-          <w:szCs w:val="28"/>
-        </w:rPr>
-        <w:t xml:space="preserve"> and DAC Reconstruction</w:t>
+        <w:t>ation and DAC Reconstruction</w:t>
       </w:r>
     </w:p>
     <w:p>
@@ -739,13 +717,13 @@
           <w:rFonts w:cs="Arial"/>
           <w:b/>
           <w:bCs/>
-          <w:lang w:val="en-IE"/>
+          <w:lang w:val="es-ES"/>
         </w:rPr>
       </w:pPr>
       <w:r>
         <w:rPr>
           <w:rFonts w:ascii="Trebuchet MS" w:hAnsi="Trebuchet MS"/>
-          <w:lang w:val="en-IE"/>
+          <w:lang w:val="es-ES"/>
         </w:rPr>
         <w:br w:type="page"/>
       </w:r>
@@ -754,7 +732,7 @@
           <w:rFonts w:cs="Arial"/>
           <w:b/>
           <w:bCs/>
-          <w:lang w:val="en-IE"/>
+          <w:lang w:val="es-ES"/>
         </w:rPr>
         <w:lastRenderedPageBreak/>
         <w:t xml:space="preserve">Objective: </w:t>
@@ -764,1071 +742,30 @@
       <w:pPr>
         <w:rPr>
           <w:rFonts w:cs="Arial"/>
-          <w:lang w:val="en-IE"/>
-        </w:rPr>
-      </w:pPr>
-    </w:p>
-    <w:p>
-      <w:pPr>
-        <w:rPr>
-          <w:rFonts w:cs="Arial"/>
-          <w:lang w:val="en-IE"/>
-        </w:rPr>
-      </w:pPr>
-      <w:r>
-        <w:rPr>
-          <w:rFonts w:cs="Arial"/>
-        </w:rPr>
-        <w:t xml:space="preserve">El </w:t>
-      </w:r>
-      <w:proofErr w:type="spellStart"/>
-      <w:r>
-        <w:rPr>
-          <w:rFonts w:cs="Arial"/>
-        </w:rPr>
-        <w:t>objetivo</w:t>
-      </w:r>
-      <w:proofErr w:type="spellEnd"/>
-      <w:r>
-        <w:rPr>
-          <w:rFonts w:cs="Arial"/>
-        </w:rPr>
-        <w:t xml:space="preserve"> principal de </w:t>
-      </w:r>
-      <w:proofErr w:type="spellStart"/>
-      <w:r>
-        <w:rPr>
-          <w:rFonts w:cs="Arial"/>
-        </w:rPr>
-        <w:t>esta</w:t>
-      </w:r>
-      <w:proofErr w:type="spellEnd"/>
-      <w:r>
-        <w:rPr>
-          <w:rFonts w:cs="Arial"/>
-        </w:rPr>
-        <w:t xml:space="preserve"> </w:t>
-      </w:r>
-      <w:proofErr w:type="spellStart"/>
-      <w:r>
-        <w:rPr>
-          <w:rFonts w:cs="Arial"/>
-        </w:rPr>
-        <w:t>práctica</w:t>
-      </w:r>
-      <w:proofErr w:type="spellEnd"/>
-      <w:r>
-        <w:rPr>
-          <w:rFonts w:cs="Arial"/>
-        </w:rPr>
-        <w:t xml:space="preserve"> </w:t>
-      </w:r>
-      <w:proofErr w:type="spellStart"/>
-      <w:r>
-        <w:rPr>
-          <w:rFonts w:cs="Arial"/>
-        </w:rPr>
-        <w:t>fue</w:t>
-      </w:r>
-      <w:proofErr w:type="spellEnd"/>
-      <w:r>
-        <w:rPr>
-          <w:rFonts w:cs="Arial"/>
-        </w:rPr>
-        <w:t xml:space="preserve"> </w:t>
-      </w:r>
-      <w:proofErr w:type="spellStart"/>
-      <w:r>
-        <w:rPr>
-          <w:rFonts w:cs="Arial"/>
-        </w:rPr>
-        <w:t>diseñar</w:t>
-      </w:r>
-      <w:proofErr w:type="spellEnd"/>
-      <w:r>
-        <w:rPr>
-          <w:rFonts w:cs="Arial"/>
-        </w:rPr>
-        <w:t xml:space="preserve"> e </w:t>
-      </w:r>
-      <w:proofErr w:type="spellStart"/>
-      <w:r>
-        <w:rPr>
-          <w:rFonts w:cs="Arial"/>
-        </w:rPr>
-        <w:t>implementar</w:t>
-      </w:r>
-      <w:proofErr w:type="spellEnd"/>
-      <w:r>
-        <w:rPr>
-          <w:rFonts w:cs="Arial"/>
-        </w:rPr>
-        <w:t xml:space="preserve"> un </w:t>
-      </w:r>
-      <w:proofErr w:type="spellStart"/>
-      <w:r>
-        <w:rPr>
-          <w:rFonts w:cs="Arial"/>
-        </w:rPr>
-        <w:t>sistema</w:t>
-      </w:r>
-      <w:proofErr w:type="spellEnd"/>
-      <w:r>
-        <w:rPr>
-          <w:rFonts w:cs="Arial"/>
-        </w:rPr>
-        <w:t xml:space="preserve"> de </w:t>
-      </w:r>
-      <w:proofErr w:type="spellStart"/>
-      <w:r>
-        <w:rPr>
-          <w:rFonts w:cs="Arial"/>
-        </w:rPr>
-        <w:t>Modulación</w:t>
-      </w:r>
-      <w:proofErr w:type="spellEnd"/>
-      <w:r>
-        <w:rPr>
-          <w:rFonts w:cs="Arial"/>
-        </w:rPr>
-        <w:t xml:space="preserve"> </w:t>
-      </w:r>
-      <w:proofErr w:type="spellStart"/>
-      <w:r>
-        <w:rPr>
-          <w:rFonts w:cs="Arial"/>
-        </w:rPr>
-        <w:t>por</w:t>
-      </w:r>
-      <w:proofErr w:type="spellEnd"/>
-      <w:r>
-        <w:rPr>
-          <w:rFonts w:cs="Arial"/>
-        </w:rPr>
-        <w:t xml:space="preserve"> </w:t>
-      </w:r>
-      <w:proofErr w:type="spellStart"/>
-      <w:r>
-        <w:rPr>
-          <w:rFonts w:cs="Arial"/>
-        </w:rPr>
-        <w:t>Impulsos</w:t>
-      </w:r>
-      <w:proofErr w:type="spellEnd"/>
-      <w:r>
-        <w:rPr>
-          <w:rFonts w:cs="Arial"/>
-        </w:rPr>
-        <w:t xml:space="preserve"> </w:t>
-      </w:r>
-      <w:proofErr w:type="spellStart"/>
-      <w:r>
-        <w:rPr>
-          <w:rFonts w:cs="Arial"/>
-        </w:rPr>
-        <w:t>Codificados</w:t>
-      </w:r>
-      <w:proofErr w:type="spellEnd"/>
-      <w:r>
-        <w:rPr>
-          <w:rFonts w:cs="Arial"/>
-        </w:rPr>
-        <w:t xml:space="preserve"> (PCM) de 4 bits para </w:t>
-      </w:r>
-      <w:proofErr w:type="spellStart"/>
-      <w:r>
-        <w:rPr>
-          <w:rFonts w:cs="Arial"/>
-        </w:rPr>
-        <w:t>digitalizar</w:t>
-      </w:r>
-      <w:proofErr w:type="spellEnd"/>
-      <w:r>
-        <w:rPr>
-          <w:rFonts w:cs="Arial"/>
-        </w:rPr>
-        <w:t xml:space="preserve"> </w:t>
-      </w:r>
-      <w:proofErr w:type="spellStart"/>
-      <w:r>
-        <w:rPr>
-          <w:rFonts w:cs="Arial"/>
-        </w:rPr>
-        <w:t>una</w:t>
-      </w:r>
-      <w:proofErr w:type="spellEnd"/>
-      <w:r>
-        <w:rPr>
-          <w:rFonts w:cs="Arial"/>
-        </w:rPr>
-        <w:t xml:space="preserve"> </w:t>
-      </w:r>
-      <w:proofErr w:type="spellStart"/>
-      <w:r>
-        <w:rPr>
-          <w:rFonts w:cs="Arial"/>
-        </w:rPr>
-        <w:t>onda</w:t>
-      </w:r>
-      <w:proofErr w:type="spellEnd"/>
-      <w:r>
-        <w:rPr>
-          <w:rFonts w:cs="Arial"/>
-        </w:rPr>
-        <w:t xml:space="preserve"> </w:t>
-      </w:r>
-      <w:proofErr w:type="spellStart"/>
-      <w:r>
-        <w:rPr>
-          <w:rFonts w:cs="Arial"/>
-        </w:rPr>
-        <w:t>senoidal</w:t>
-      </w:r>
-      <w:proofErr w:type="spellEnd"/>
-      <w:r>
-        <w:rPr>
-          <w:rFonts w:cs="Arial"/>
-        </w:rPr>
-        <w:t xml:space="preserve"> y </w:t>
-      </w:r>
-      <w:proofErr w:type="spellStart"/>
-      <w:r>
-        <w:rPr>
-          <w:rFonts w:cs="Arial"/>
-        </w:rPr>
-        <w:t>reconstruirla</w:t>
-      </w:r>
-      <w:proofErr w:type="spellEnd"/>
-      <w:r>
-        <w:rPr>
-          <w:rFonts w:cs="Arial"/>
-        </w:rPr>
-        <w:t xml:space="preserve"> </w:t>
-      </w:r>
-      <w:proofErr w:type="spellStart"/>
-      <w:r>
-        <w:rPr>
-          <w:rFonts w:cs="Arial"/>
-        </w:rPr>
-        <w:t>mediante</w:t>
-      </w:r>
-      <w:proofErr w:type="spellEnd"/>
-      <w:r>
-        <w:rPr>
-          <w:rFonts w:cs="Arial"/>
-        </w:rPr>
-        <w:t xml:space="preserve"> un </w:t>
-      </w:r>
-      <w:proofErr w:type="spellStart"/>
-      <w:r>
-        <w:rPr>
-          <w:rFonts w:cs="Arial"/>
-        </w:rPr>
-        <w:t>circuito</w:t>
-      </w:r>
-      <w:proofErr w:type="spellEnd"/>
-      <w:r>
-        <w:rPr>
-          <w:rFonts w:cs="Arial"/>
-        </w:rPr>
-        <w:t xml:space="preserve"> </w:t>
-      </w:r>
-      <w:proofErr w:type="spellStart"/>
-      <w:r>
-        <w:rPr>
-          <w:rFonts w:cs="Arial"/>
-        </w:rPr>
-        <w:t>amplificador</w:t>
-      </w:r>
-      <w:proofErr w:type="spellEnd"/>
-      <w:r>
-        <w:rPr>
-          <w:rFonts w:cs="Arial"/>
-        </w:rPr>
-        <w:t xml:space="preserve"> </w:t>
-      </w:r>
-      <w:proofErr w:type="spellStart"/>
-      <w:r>
-        <w:rPr>
-          <w:rFonts w:cs="Arial"/>
-        </w:rPr>
-        <w:t>sumador</w:t>
-      </w:r>
-      <w:proofErr w:type="spellEnd"/>
-      <w:r>
-        <w:rPr>
-          <w:rFonts w:cs="Arial"/>
-        </w:rPr>
-        <w:t xml:space="preserve"> </w:t>
-      </w:r>
-      <w:proofErr w:type="spellStart"/>
-      <w:r>
-        <w:rPr>
-          <w:rFonts w:cs="Arial"/>
-        </w:rPr>
-        <w:t>discreto</w:t>
-      </w:r>
-      <w:proofErr w:type="spellEnd"/>
-      <w:r>
-        <w:rPr>
-          <w:rFonts w:cs="Arial"/>
-        </w:rPr>
-        <w:t xml:space="preserve">. Este </w:t>
-      </w:r>
-      <w:proofErr w:type="spellStart"/>
-      <w:r>
-        <w:rPr>
-          <w:rFonts w:cs="Arial"/>
-        </w:rPr>
-        <w:t>proceso</w:t>
-      </w:r>
-      <w:proofErr w:type="spellEnd"/>
-      <w:r>
-        <w:rPr>
-          <w:rFonts w:cs="Arial"/>
-        </w:rPr>
-        <w:t xml:space="preserve"> </w:t>
-      </w:r>
-      <w:proofErr w:type="spellStart"/>
-      <w:r>
-        <w:rPr>
-          <w:rFonts w:cs="Arial"/>
-        </w:rPr>
-        <w:t>permitió</w:t>
-      </w:r>
-      <w:proofErr w:type="spellEnd"/>
-      <w:r>
-        <w:rPr>
-          <w:rFonts w:cs="Arial"/>
-        </w:rPr>
-        <w:t xml:space="preserve"> </w:t>
-      </w:r>
-      <w:proofErr w:type="spellStart"/>
-      <w:r>
-        <w:rPr>
-          <w:rFonts w:cs="Arial"/>
-        </w:rPr>
-        <w:t>consolidar</w:t>
-      </w:r>
-      <w:proofErr w:type="spellEnd"/>
-      <w:r>
-        <w:rPr>
-          <w:rFonts w:cs="Arial"/>
-        </w:rPr>
-        <w:t xml:space="preserve"> </w:t>
-      </w:r>
-      <w:proofErr w:type="spellStart"/>
-      <w:r>
-        <w:rPr>
-          <w:rFonts w:cs="Arial"/>
-        </w:rPr>
-        <w:t>los</w:t>
-      </w:r>
-      <w:proofErr w:type="spellEnd"/>
-      <w:r>
-        <w:rPr>
-          <w:rFonts w:cs="Arial"/>
-        </w:rPr>
-        <w:t xml:space="preserve"> </w:t>
-      </w:r>
-      <w:proofErr w:type="spellStart"/>
-      <w:r>
-        <w:rPr>
-          <w:rFonts w:cs="Arial"/>
-        </w:rPr>
-        <w:t>fundamentos</w:t>
-      </w:r>
-      <w:proofErr w:type="spellEnd"/>
-      <w:r>
-        <w:rPr>
-          <w:rFonts w:cs="Arial"/>
-        </w:rPr>
-        <w:t xml:space="preserve"> </w:t>
-      </w:r>
-      <w:proofErr w:type="spellStart"/>
-      <w:r>
-        <w:rPr>
-          <w:rFonts w:cs="Arial"/>
-        </w:rPr>
-        <w:t>teóricos</w:t>
-      </w:r>
-      <w:proofErr w:type="spellEnd"/>
-      <w:r>
-        <w:rPr>
-          <w:rFonts w:cs="Arial"/>
-        </w:rPr>
-        <w:t xml:space="preserve"> </w:t>
-      </w:r>
-      <w:proofErr w:type="spellStart"/>
-      <w:r>
-        <w:rPr>
-          <w:rFonts w:cs="Arial"/>
-        </w:rPr>
-        <w:t>mediante</w:t>
-      </w:r>
-      <w:proofErr w:type="spellEnd"/>
-      <w:r>
-        <w:rPr>
-          <w:rFonts w:cs="Arial"/>
-        </w:rPr>
-        <w:t xml:space="preserve"> la </w:t>
-      </w:r>
-      <w:proofErr w:type="spellStart"/>
-      <w:r>
-        <w:rPr>
-          <w:rFonts w:cs="Arial"/>
-        </w:rPr>
-        <w:t>implementación</w:t>
-      </w:r>
-      <w:proofErr w:type="spellEnd"/>
-      <w:r>
-        <w:rPr>
-          <w:rFonts w:cs="Arial"/>
-        </w:rPr>
-        <w:t xml:space="preserve"> </w:t>
-      </w:r>
-      <w:proofErr w:type="spellStart"/>
-      <w:r>
-        <w:rPr>
-          <w:rFonts w:cs="Arial"/>
-        </w:rPr>
-        <w:t>práctica</w:t>
-      </w:r>
-      <w:proofErr w:type="spellEnd"/>
-      <w:r>
-        <w:rPr>
-          <w:rFonts w:cs="Arial"/>
-        </w:rPr>
-        <w:t xml:space="preserve"> de </w:t>
-      </w:r>
-      <w:proofErr w:type="spellStart"/>
-      <w:r>
-        <w:rPr>
-          <w:rFonts w:cs="Arial"/>
-        </w:rPr>
-        <w:t>rutinas</w:t>
-      </w:r>
-      <w:proofErr w:type="spellEnd"/>
-      <w:r>
-        <w:rPr>
-          <w:rFonts w:cs="Arial"/>
-        </w:rPr>
-        <w:t xml:space="preserve"> de </w:t>
-      </w:r>
-      <w:proofErr w:type="spellStart"/>
-      <w:r>
-        <w:rPr>
-          <w:rFonts w:cs="Arial"/>
-        </w:rPr>
-        <w:t>muestreo</w:t>
-      </w:r>
-      <w:proofErr w:type="spellEnd"/>
-      <w:r>
-        <w:rPr>
-          <w:rFonts w:cs="Arial"/>
-        </w:rPr>
-        <w:t xml:space="preserve"> </w:t>
-      </w:r>
-      <w:proofErr w:type="spellStart"/>
-      <w:r>
-        <w:rPr>
-          <w:rFonts w:cs="Arial"/>
-        </w:rPr>
-        <w:t>utilizando</w:t>
-      </w:r>
-      <w:proofErr w:type="spellEnd"/>
-      <w:r>
-        <w:rPr>
-          <w:rFonts w:cs="Arial"/>
-        </w:rPr>
-        <w:t xml:space="preserve"> </w:t>
-      </w:r>
-      <w:proofErr w:type="spellStart"/>
-      <w:r>
-        <w:rPr>
-          <w:rFonts w:cs="Arial"/>
-        </w:rPr>
-        <w:t>los</w:t>
-      </w:r>
-      <w:proofErr w:type="spellEnd"/>
-      <w:r>
-        <w:rPr>
-          <w:rFonts w:cs="Arial"/>
-        </w:rPr>
-        <w:t xml:space="preserve"> </w:t>
-      </w:r>
-      <w:proofErr w:type="spellStart"/>
-      <w:r>
-        <w:rPr>
-          <w:rFonts w:cs="Arial"/>
-        </w:rPr>
-        <w:t>temporizadores</w:t>
-      </w:r>
-      <w:proofErr w:type="spellEnd"/>
-      <w:r>
-        <w:rPr>
-          <w:rFonts w:cs="Arial"/>
-        </w:rPr>
-        <w:t xml:space="preserve"> </w:t>
-      </w:r>
-      <w:proofErr w:type="spellStart"/>
-      <w:r>
-        <w:rPr>
-          <w:rFonts w:cs="Arial"/>
-        </w:rPr>
-        <w:t>por</w:t>
-      </w:r>
-      <w:proofErr w:type="spellEnd"/>
-      <w:r>
-        <w:rPr>
-          <w:rFonts w:cs="Arial"/>
-        </w:rPr>
-        <w:t xml:space="preserve"> hardware del </w:t>
-      </w:r>
-      <w:proofErr w:type="spellStart"/>
-      <w:r>
-        <w:rPr>
-          <w:rFonts w:cs="Arial"/>
-        </w:rPr>
-        <w:t>microcontrolador</w:t>
-      </w:r>
-      <w:proofErr w:type="spellEnd"/>
-      <w:r>
-        <w:rPr>
-          <w:rFonts w:cs="Arial"/>
-        </w:rPr>
-        <w:t xml:space="preserve"> MSP430. </w:t>
-      </w:r>
-      <w:proofErr w:type="spellStart"/>
-      <w:r>
-        <w:rPr>
-          <w:rFonts w:cs="Arial"/>
-        </w:rPr>
-        <w:t>Asimismo</w:t>
-      </w:r>
-      <w:proofErr w:type="spellEnd"/>
-      <w:r>
-        <w:rPr>
-          <w:rFonts w:cs="Arial"/>
-        </w:rPr>
-        <w:t xml:space="preserve">, se </w:t>
-      </w:r>
-      <w:proofErr w:type="spellStart"/>
-      <w:r>
-        <w:rPr>
-          <w:rFonts w:cs="Arial"/>
-        </w:rPr>
-        <w:t>ejecutó</w:t>
-      </w:r>
-      <w:proofErr w:type="spellEnd"/>
-      <w:r>
-        <w:rPr>
-          <w:rFonts w:cs="Arial"/>
-        </w:rPr>
-        <w:t xml:space="preserve"> la </w:t>
-      </w:r>
-      <w:proofErr w:type="spellStart"/>
-      <w:r>
-        <w:rPr>
-          <w:rFonts w:cs="Arial"/>
-        </w:rPr>
-        <w:t>cuantización</w:t>
-      </w:r>
-      <w:proofErr w:type="spellEnd"/>
-      <w:r>
-        <w:rPr>
-          <w:rFonts w:cs="Arial"/>
-        </w:rPr>
-        <w:t xml:space="preserve"> y </w:t>
-      </w:r>
-      <w:proofErr w:type="spellStart"/>
-      <w:r>
-        <w:rPr>
-          <w:rFonts w:cs="Arial"/>
-        </w:rPr>
-        <w:t>codificación</w:t>
-      </w:r>
-      <w:proofErr w:type="spellEnd"/>
-      <w:r>
-        <w:rPr>
-          <w:rFonts w:cs="Arial"/>
-        </w:rPr>
-        <w:t xml:space="preserve"> </w:t>
-      </w:r>
-      <w:proofErr w:type="spellStart"/>
-      <w:r>
-        <w:rPr>
-          <w:rFonts w:cs="Arial"/>
-        </w:rPr>
-        <w:t>binaria</w:t>
-      </w:r>
-      <w:proofErr w:type="spellEnd"/>
-      <w:r>
-        <w:rPr>
-          <w:rFonts w:cs="Arial"/>
-        </w:rPr>
-        <w:t xml:space="preserve"> al </w:t>
-      </w:r>
-      <w:proofErr w:type="spellStart"/>
-      <w:r>
-        <w:rPr>
-          <w:rFonts w:cs="Arial"/>
-        </w:rPr>
-        <w:t>mapear</w:t>
-      </w:r>
-      <w:proofErr w:type="spellEnd"/>
-      <w:r>
-        <w:rPr>
-          <w:rFonts w:cs="Arial"/>
-        </w:rPr>
-        <w:t xml:space="preserve"> y </w:t>
-      </w:r>
-      <w:proofErr w:type="spellStart"/>
-      <w:r>
-        <w:rPr>
-          <w:rFonts w:cs="Arial"/>
-        </w:rPr>
-        <w:t>reducir</w:t>
-      </w:r>
-      <w:proofErr w:type="spellEnd"/>
-      <w:r>
-        <w:rPr>
-          <w:rFonts w:cs="Arial"/>
-        </w:rPr>
-        <w:t xml:space="preserve"> </w:t>
-      </w:r>
-      <w:proofErr w:type="spellStart"/>
-      <w:r>
-        <w:rPr>
-          <w:rFonts w:cs="Arial"/>
-        </w:rPr>
-        <w:t>los</w:t>
-      </w:r>
-      <w:proofErr w:type="spellEnd"/>
-      <w:r>
-        <w:rPr>
-          <w:rFonts w:cs="Arial"/>
-        </w:rPr>
-        <w:t xml:space="preserve"> </w:t>
-      </w:r>
-      <w:proofErr w:type="spellStart"/>
-      <w:r>
-        <w:rPr>
-          <w:rFonts w:cs="Arial"/>
-        </w:rPr>
-        <w:t>datos</w:t>
-      </w:r>
-      <w:proofErr w:type="spellEnd"/>
-      <w:r>
-        <w:rPr>
-          <w:rFonts w:cs="Arial"/>
-        </w:rPr>
-        <w:t xml:space="preserve"> </w:t>
-      </w:r>
-      <w:proofErr w:type="spellStart"/>
-      <w:r>
-        <w:rPr>
-          <w:rFonts w:cs="Arial"/>
-        </w:rPr>
-        <w:t>originales</w:t>
-      </w:r>
-      <w:proofErr w:type="spellEnd"/>
-      <w:r>
-        <w:rPr>
-          <w:rFonts w:cs="Arial"/>
-        </w:rPr>
-        <w:t xml:space="preserve"> de 10 bits del ADC </w:t>
-      </w:r>
-      <w:proofErr w:type="spellStart"/>
-      <w:r>
-        <w:rPr>
-          <w:rFonts w:cs="Arial"/>
-        </w:rPr>
-        <w:t>hacia</w:t>
-      </w:r>
-      <w:proofErr w:type="spellEnd"/>
-      <w:r>
-        <w:rPr>
-          <w:rFonts w:cs="Arial"/>
-        </w:rPr>
-        <w:t xml:space="preserve"> </w:t>
-      </w:r>
-      <w:proofErr w:type="spellStart"/>
-      <w:r>
-        <w:rPr>
-          <w:rFonts w:cs="Arial"/>
-        </w:rPr>
-        <w:t>una</w:t>
-      </w:r>
-      <w:proofErr w:type="spellEnd"/>
-      <w:r>
-        <w:rPr>
-          <w:rFonts w:cs="Arial"/>
-        </w:rPr>
-        <w:t xml:space="preserve"> salida </w:t>
-      </w:r>
-      <w:proofErr w:type="spellStart"/>
-      <w:r>
-        <w:rPr>
-          <w:rFonts w:cs="Arial"/>
-        </w:rPr>
-        <w:t>paralela</w:t>
-      </w:r>
-      <w:proofErr w:type="spellEnd"/>
-      <w:r>
-        <w:rPr>
-          <w:rFonts w:cs="Arial"/>
-        </w:rPr>
-        <w:t xml:space="preserve"> de 4 bits. </w:t>
-      </w:r>
-      <w:proofErr w:type="spellStart"/>
-      <w:r>
-        <w:rPr>
-          <w:rFonts w:cs="Arial"/>
-        </w:rPr>
-        <w:t>Finalmente</w:t>
-      </w:r>
-      <w:proofErr w:type="spellEnd"/>
-      <w:r>
-        <w:rPr>
-          <w:rFonts w:cs="Arial"/>
-        </w:rPr>
-        <w:t xml:space="preserve">, a </w:t>
-      </w:r>
-      <w:proofErr w:type="spellStart"/>
-      <w:r>
-        <w:rPr>
-          <w:rFonts w:cs="Arial"/>
-        </w:rPr>
-        <w:t>partir</w:t>
-      </w:r>
-      <w:proofErr w:type="spellEnd"/>
-      <w:r>
-        <w:rPr>
-          <w:rFonts w:cs="Arial"/>
-        </w:rPr>
-        <w:t xml:space="preserve"> de </w:t>
-      </w:r>
-      <w:proofErr w:type="spellStart"/>
-      <w:r>
-        <w:rPr>
-          <w:rFonts w:cs="Arial"/>
-        </w:rPr>
-        <w:t>estos</w:t>
-      </w:r>
-      <w:proofErr w:type="spellEnd"/>
-      <w:r>
-        <w:rPr>
-          <w:rFonts w:cs="Arial"/>
-        </w:rPr>
-        <w:t xml:space="preserve"> </w:t>
-      </w:r>
-      <w:proofErr w:type="spellStart"/>
-      <w:r>
-        <w:rPr>
-          <w:rFonts w:cs="Arial"/>
-        </w:rPr>
-        <w:t>datos</w:t>
-      </w:r>
-      <w:proofErr w:type="spellEnd"/>
-      <w:r>
-        <w:rPr>
-          <w:rFonts w:cs="Arial"/>
-        </w:rPr>
-        <w:t xml:space="preserve"> </w:t>
-      </w:r>
-      <w:proofErr w:type="spellStart"/>
-      <w:r>
-        <w:rPr>
-          <w:rFonts w:cs="Arial"/>
-        </w:rPr>
-        <w:t>digitales</w:t>
-      </w:r>
-      <w:proofErr w:type="spellEnd"/>
-      <w:r>
-        <w:rPr>
-          <w:rFonts w:cs="Arial"/>
-        </w:rPr>
-        <w:t xml:space="preserve">, se </w:t>
-      </w:r>
-      <w:proofErr w:type="spellStart"/>
-      <w:r>
-        <w:rPr>
-          <w:rFonts w:cs="Arial"/>
-        </w:rPr>
-        <w:t>logró</w:t>
-      </w:r>
-      <w:proofErr w:type="spellEnd"/>
-      <w:r>
-        <w:rPr>
-          <w:rFonts w:cs="Arial"/>
-        </w:rPr>
-        <w:t xml:space="preserve"> </w:t>
-      </w:r>
-      <w:proofErr w:type="spellStart"/>
-      <w:r>
-        <w:rPr>
-          <w:rFonts w:cs="Arial"/>
-        </w:rPr>
-        <w:t>reconstruir</w:t>
-      </w:r>
-      <w:proofErr w:type="spellEnd"/>
-      <w:r>
-        <w:rPr>
-          <w:rFonts w:cs="Arial"/>
-        </w:rPr>
-        <w:t xml:space="preserve"> la </w:t>
-      </w:r>
-      <w:proofErr w:type="spellStart"/>
-      <w:r>
-        <w:rPr>
-          <w:rFonts w:cs="Arial"/>
-        </w:rPr>
-        <w:t>señal</w:t>
-      </w:r>
-      <w:proofErr w:type="spellEnd"/>
-      <w:r>
-        <w:rPr>
-          <w:rFonts w:cs="Arial"/>
-        </w:rPr>
-        <w:t xml:space="preserve"> </w:t>
-      </w:r>
-      <w:proofErr w:type="spellStart"/>
-      <w:r>
-        <w:rPr>
-          <w:rFonts w:cs="Arial"/>
-        </w:rPr>
-        <w:t>analógica</w:t>
-      </w:r>
-      <w:proofErr w:type="spellEnd"/>
-      <w:r>
-        <w:rPr>
-          <w:rFonts w:cs="Arial"/>
-        </w:rPr>
-        <w:t xml:space="preserve"> original y se </w:t>
-      </w:r>
-      <w:proofErr w:type="spellStart"/>
-      <w:r>
-        <w:rPr>
-          <w:rFonts w:cs="Arial"/>
-        </w:rPr>
-        <w:t>evaluaron</w:t>
-      </w:r>
-      <w:proofErr w:type="spellEnd"/>
-      <w:r>
-        <w:rPr>
-          <w:rFonts w:cs="Arial"/>
-        </w:rPr>
-        <w:t xml:space="preserve"> las </w:t>
-      </w:r>
-      <w:proofErr w:type="spellStart"/>
-      <w:r>
-        <w:rPr>
-          <w:rFonts w:cs="Arial"/>
-        </w:rPr>
-        <w:t>limitaciones</w:t>
-      </w:r>
-      <w:proofErr w:type="spellEnd"/>
-      <w:r>
-        <w:rPr>
-          <w:rFonts w:cs="Arial"/>
-        </w:rPr>
-        <w:t xml:space="preserve"> </w:t>
-      </w:r>
-      <w:proofErr w:type="spellStart"/>
-      <w:r>
-        <w:rPr>
-          <w:rFonts w:cs="Arial"/>
-        </w:rPr>
-        <w:t>inherentes</w:t>
-      </w:r>
-      <w:proofErr w:type="spellEnd"/>
-      <w:r>
-        <w:rPr>
-          <w:rFonts w:cs="Arial"/>
-        </w:rPr>
-        <w:t xml:space="preserve"> del </w:t>
-      </w:r>
-      <w:proofErr w:type="spellStart"/>
-      <w:r>
-        <w:rPr>
-          <w:rFonts w:cs="Arial"/>
-        </w:rPr>
-        <w:t>sistema</w:t>
-      </w:r>
-      <w:proofErr w:type="spellEnd"/>
-      <w:r>
-        <w:rPr>
-          <w:rFonts w:cs="Arial"/>
-        </w:rPr>
-        <w:t xml:space="preserve">, tales </w:t>
-      </w:r>
-      <w:proofErr w:type="spellStart"/>
-      <w:r>
-        <w:rPr>
-          <w:rFonts w:cs="Arial"/>
-        </w:rPr>
-        <w:t>como</w:t>
-      </w:r>
-      <w:proofErr w:type="spellEnd"/>
-      <w:r>
-        <w:rPr>
-          <w:rFonts w:cs="Arial"/>
-        </w:rPr>
-        <w:t xml:space="preserve"> el </w:t>
-      </w:r>
-      <w:proofErr w:type="spellStart"/>
-      <w:r>
-        <w:rPr>
-          <w:rFonts w:cs="Arial"/>
-        </w:rPr>
-        <w:t>ruido</w:t>
-      </w:r>
-      <w:proofErr w:type="spellEnd"/>
-      <w:r>
-        <w:rPr>
-          <w:rFonts w:cs="Arial"/>
-        </w:rPr>
-        <w:t xml:space="preserve"> de </w:t>
-      </w:r>
-      <w:proofErr w:type="spellStart"/>
-      <w:r>
-        <w:rPr>
-          <w:rFonts w:cs="Arial"/>
-        </w:rPr>
-        <w:t>cuantización</w:t>
-      </w:r>
-      <w:proofErr w:type="spellEnd"/>
-      <w:r>
-        <w:rPr>
-          <w:rFonts w:cs="Arial"/>
-        </w:rPr>
-        <w:t xml:space="preserve">, las </w:t>
-      </w:r>
-      <w:proofErr w:type="spellStart"/>
-      <w:r>
-        <w:rPr>
-          <w:rFonts w:cs="Arial"/>
-        </w:rPr>
-        <w:t>restricciones</w:t>
-      </w:r>
-      <w:proofErr w:type="spellEnd"/>
-      <w:r>
-        <w:rPr>
-          <w:rFonts w:cs="Arial"/>
-        </w:rPr>
-        <w:t xml:space="preserve"> </w:t>
-      </w:r>
-      <w:proofErr w:type="spellStart"/>
-      <w:r>
-        <w:rPr>
-          <w:rFonts w:cs="Arial"/>
-        </w:rPr>
-        <w:t>en</w:t>
-      </w:r>
-      <w:proofErr w:type="spellEnd"/>
-      <w:r>
-        <w:rPr>
-          <w:rFonts w:cs="Arial"/>
-        </w:rPr>
-        <w:t xml:space="preserve"> el </w:t>
-      </w:r>
-      <w:proofErr w:type="spellStart"/>
-      <w:r>
-        <w:rPr>
-          <w:rFonts w:cs="Arial"/>
-        </w:rPr>
-        <w:t>escalado</w:t>
-      </w:r>
-      <w:proofErr w:type="spellEnd"/>
-      <w:r>
-        <w:rPr>
-          <w:rFonts w:cs="Arial"/>
-        </w:rPr>
-        <w:t xml:space="preserve"> de </w:t>
-      </w:r>
-      <w:proofErr w:type="spellStart"/>
-      <w:r>
-        <w:rPr>
-          <w:rFonts w:cs="Arial"/>
-        </w:rPr>
-        <w:t>voltajes</w:t>
-      </w:r>
-      <w:proofErr w:type="spellEnd"/>
-      <w:r>
-        <w:rPr>
-          <w:rFonts w:cs="Arial"/>
-        </w:rPr>
-        <w:t xml:space="preserve"> y la </w:t>
-      </w:r>
-      <w:proofErr w:type="spellStart"/>
-      <w:r>
-        <w:rPr>
-          <w:rFonts w:cs="Arial"/>
-        </w:rPr>
-        <w:t>distorsión</w:t>
-      </w:r>
-      <w:proofErr w:type="spellEnd"/>
-      <w:r>
-        <w:rPr>
-          <w:rFonts w:cs="Arial"/>
-        </w:rPr>
-        <w:t xml:space="preserve"> </w:t>
-      </w:r>
-      <w:proofErr w:type="spellStart"/>
-      <w:r>
-        <w:rPr>
-          <w:rFonts w:cs="Arial"/>
-        </w:rPr>
-        <w:t>generada</w:t>
-      </w:r>
-      <w:proofErr w:type="spellEnd"/>
-      <w:r>
-        <w:rPr>
-          <w:rFonts w:cs="Arial"/>
-        </w:rPr>
-        <w:t xml:space="preserve"> </w:t>
-      </w:r>
-      <w:proofErr w:type="spellStart"/>
-      <w:r>
-        <w:rPr>
-          <w:rFonts w:cs="Arial"/>
-        </w:rPr>
-        <w:t>por</w:t>
-      </w:r>
-      <w:proofErr w:type="spellEnd"/>
-      <w:r>
-        <w:rPr>
-          <w:rFonts w:cs="Arial"/>
-        </w:rPr>
-        <w:t xml:space="preserve"> el </w:t>
-      </w:r>
-      <w:proofErr w:type="spellStart"/>
-      <w:r>
-        <w:rPr>
-          <w:rFonts w:cs="Arial"/>
-        </w:rPr>
-        <w:t>efecto</w:t>
-      </w:r>
-      <w:proofErr w:type="spellEnd"/>
-      <w:r>
-        <w:rPr>
-          <w:rFonts w:cs="Arial"/>
-        </w:rPr>
-        <w:t xml:space="preserve"> de </w:t>
-      </w:r>
-      <w:r>
-        <w:rPr>
-          <w:rFonts w:cs="Arial"/>
-        </w:rPr>
-        <w:t>aliasing.</w:t>
-      </w:r>
-    </w:p>
-    <w:p>
-      <w:pPr>
-        <w:rPr>
-          <w:rFonts w:cs="Arial"/>
-          <w:lang w:val="en-IE"/>
+          <w:lang w:val="es-ES"/>
+        </w:rPr>
+      </w:pPr>
+    </w:p>
+    <w:p>
+      <w:pPr>
+        <w:rPr>
+          <w:rFonts w:cs="Arial"/>
+          <w:lang w:val="es-ES"/>
+        </w:rPr>
+      </w:pPr>
+      <w:r>
+        <w:rPr>
+          <w:rFonts w:cs="Arial"/>
+          <w:lang w:val="es-ES"/>
+        </w:rPr>
+        <w:t>El objetivo principal de esta práctica fue diseñar e implementar un sistema de Modulación por Impulsos Codificados (PCM) de 4 bits para digitalizar una onda senoidal y reconstruirla mediante un circuito amplificador sumador discreto. Este proceso permitió consolidar los fundamentos teóricos mediante la implementación práctica de rutinas de muestreo utilizando los temporizadores por hardware del microcontrolador MSP430. Asimismo, se ejecutó la cuantización y codificación binaria al mapear y reducir los datos originales de 10 bits del ADC hacia una salida paralela de 4 bits. Finalmente, a partir de estos datos digitales, se logró reconstruir la señal analógica original y se evaluaron las limitaciones inherentes del sistema, tales como el ruido de cuantización, las restricciones en el escalado de voltajes y la distorsión generada por el efecto de aliasing.</w:t>
+      </w:r>
+    </w:p>
+    <w:p>
+      <w:pPr>
+        <w:rPr>
+          <w:rFonts w:cs="Arial"/>
+          <w:lang w:val="es-ES"/>
         </w:rPr>
       </w:pPr>
     </w:p>
@@ -1838,7 +775,7 @@
           <w:rFonts w:cs="Arial"/>
           <w:b/>
           <w:bCs/>
-          <w:lang w:val="en-IE"/>
+          <w:lang w:val="es-ES"/>
         </w:rPr>
       </w:pPr>
       <w:r>
@@ -1846,7 +783,7 @@
           <w:rFonts w:cs="Arial"/>
           <w:b/>
           <w:bCs/>
-          <w:lang w:val="en-IE"/>
+          <w:lang w:val="es-ES"/>
         </w:rPr>
         <w:t>Theory:</w:t>
       </w:r>
@@ -1855,637 +792,70 @@
       <w:pPr>
         <w:rPr>
           <w:rFonts w:cs="Arial"/>
-        </w:rPr>
-      </w:pPr>
-      <w:r>
-        <w:rPr>
-          <w:rFonts w:cs="Arial"/>
-        </w:rPr>
-        <w:t xml:space="preserve">El </w:t>
-      </w:r>
-      <w:proofErr w:type="spellStart"/>
-      <w:r>
-        <w:rPr>
-          <w:rFonts w:cs="Arial"/>
-        </w:rPr>
-        <w:t>proceso</w:t>
-      </w:r>
-      <w:proofErr w:type="spellEnd"/>
-      <w:r>
-        <w:rPr>
-          <w:rFonts w:cs="Arial"/>
-        </w:rPr>
-        <w:t xml:space="preserve"> de </w:t>
-      </w:r>
-      <w:proofErr w:type="spellStart"/>
-      <w:r>
-        <w:rPr>
-          <w:rFonts w:cs="Arial"/>
-        </w:rPr>
-        <w:t>Modulación</w:t>
-      </w:r>
-      <w:proofErr w:type="spellEnd"/>
-      <w:r>
-        <w:rPr>
-          <w:rFonts w:cs="Arial"/>
-        </w:rPr>
-        <w:t xml:space="preserve"> </w:t>
-      </w:r>
-      <w:proofErr w:type="spellStart"/>
-      <w:r>
-        <w:rPr>
-          <w:rFonts w:cs="Arial"/>
-        </w:rPr>
-        <w:t>por</w:t>
-      </w:r>
-      <w:proofErr w:type="spellEnd"/>
-      <w:r>
-        <w:rPr>
-          <w:rFonts w:cs="Arial"/>
-        </w:rPr>
-        <w:t xml:space="preserve"> </w:t>
-      </w:r>
-      <w:proofErr w:type="spellStart"/>
-      <w:r>
-        <w:rPr>
-          <w:rFonts w:cs="Arial"/>
-        </w:rPr>
-        <w:t>Impulsos</w:t>
-      </w:r>
-      <w:proofErr w:type="spellEnd"/>
-      <w:r>
-        <w:rPr>
-          <w:rFonts w:cs="Arial"/>
-        </w:rPr>
-        <w:t xml:space="preserve"> </w:t>
-      </w:r>
-      <w:proofErr w:type="spellStart"/>
-      <w:r>
-        <w:rPr>
-          <w:rFonts w:cs="Arial"/>
-        </w:rPr>
-        <w:t>Codificados</w:t>
-      </w:r>
-      <w:proofErr w:type="spellEnd"/>
-      <w:r>
-        <w:rPr>
-          <w:rFonts w:cs="Arial"/>
-        </w:rPr>
-        <w:t xml:space="preserve"> (PCM) </w:t>
-      </w:r>
-      <w:proofErr w:type="spellStart"/>
-      <w:r>
-        <w:rPr>
-          <w:rFonts w:cs="Arial"/>
-        </w:rPr>
-        <w:t>consta</w:t>
-      </w:r>
-      <w:proofErr w:type="spellEnd"/>
-      <w:r>
-        <w:rPr>
-          <w:rFonts w:cs="Arial"/>
-        </w:rPr>
-        <w:t xml:space="preserve"> de </w:t>
-      </w:r>
-      <w:proofErr w:type="spellStart"/>
-      <w:r>
-        <w:rPr>
-          <w:rFonts w:cs="Arial"/>
-        </w:rPr>
-        <w:t>tres</w:t>
-      </w:r>
-      <w:proofErr w:type="spellEnd"/>
-      <w:r>
-        <w:rPr>
-          <w:rFonts w:cs="Arial"/>
-        </w:rPr>
-        <w:t xml:space="preserve"> </w:t>
-      </w:r>
-      <w:proofErr w:type="spellStart"/>
-      <w:r>
-        <w:rPr>
-          <w:rFonts w:cs="Arial"/>
-        </w:rPr>
-        <w:t>etapas</w:t>
-      </w:r>
-      <w:proofErr w:type="spellEnd"/>
-      <w:r>
-        <w:rPr>
-          <w:rFonts w:cs="Arial"/>
-        </w:rPr>
-        <w:t xml:space="preserve"> </w:t>
-      </w:r>
-      <w:proofErr w:type="spellStart"/>
-      <w:r>
-        <w:rPr>
-          <w:rFonts w:cs="Arial"/>
-        </w:rPr>
-        <w:t>fundamentales</w:t>
-      </w:r>
-      <w:proofErr w:type="spellEnd"/>
-      <w:r>
-        <w:rPr>
-          <w:rFonts w:cs="Arial"/>
-        </w:rPr>
-        <w:t xml:space="preserve">: </w:t>
-      </w:r>
-      <w:proofErr w:type="spellStart"/>
-      <w:r>
-        <w:rPr>
-          <w:rFonts w:cs="Arial"/>
-        </w:rPr>
-        <w:t>muestreo</w:t>
-      </w:r>
-      <w:proofErr w:type="spellEnd"/>
-      <w:r>
-        <w:rPr>
-          <w:rFonts w:cs="Arial"/>
-        </w:rPr>
-        <w:t xml:space="preserve"> (</w:t>
+          <w:lang w:val="es-ES"/>
+        </w:rPr>
+      </w:pPr>
+      <w:r>
+        <w:rPr>
+          <w:rFonts w:cs="Arial"/>
+          <w:lang w:val="es-ES"/>
+        </w:rPr>
+        <w:t>El proceso de Modulación por Impulsos Codificados (PCM) consta de tres etapas fundamentales: muestreo (</w:t>
       </w:r>
       <w:r>
         <w:rPr>
           <w:rFonts w:cs="Arial"/>
           <w:i/>
           <w:iCs/>
+          <w:lang w:val="es-ES"/>
         </w:rPr>
         <w:t>Sampling</w:t>
       </w:r>
       <w:r>
         <w:rPr>
           <w:rFonts w:cs="Arial"/>
-        </w:rPr>
-        <w:t xml:space="preserve">), </w:t>
-      </w:r>
-      <w:proofErr w:type="spellStart"/>
-      <w:r>
-        <w:rPr>
-          <w:rFonts w:cs="Arial"/>
-        </w:rPr>
-        <w:t>cuantización</w:t>
-      </w:r>
-      <w:proofErr w:type="spellEnd"/>
-      <w:r>
-        <w:rPr>
-          <w:rFonts w:cs="Arial"/>
-        </w:rPr>
-        <w:t xml:space="preserve"> (</w:t>
-      </w:r>
-      <w:proofErr w:type="spellStart"/>
+          <w:lang w:val="es-ES"/>
+        </w:rPr>
+        <w:t>), cuantización (</w:t>
+      </w:r>
       <w:r>
         <w:rPr>
           <w:rFonts w:cs="Arial"/>
           <w:i/>
           <w:iCs/>
+          <w:lang w:val="es-ES"/>
         </w:rPr>
         <w:t>Quantisation</w:t>
       </w:r>
-      <w:proofErr w:type="spellEnd"/>
-      <w:r>
-        <w:rPr>
-          <w:rFonts w:cs="Arial"/>
-        </w:rPr>
-        <w:t xml:space="preserve">) y </w:t>
-      </w:r>
-      <w:proofErr w:type="spellStart"/>
-      <w:r>
-        <w:rPr>
-          <w:rFonts w:cs="Arial"/>
-        </w:rPr>
-        <w:t>codificación</w:t>
-      </w:r>
-      <w:proofErr w:type="spellEnd"/>
-      <w:r>
-        <w:rPr>
-          <w:rFonts w:cs="Arial"/>
-        </w:rPr>
-        <w:t xml:space="preserve"> (</w:t>
+      <w:r>
+        <w:rPr>
+          <w:rFonts w:cs="Arial"/>
+          <w:lang w:val="es-ES"/>
+        </w:rPr>
+        <w:t>) y codificación (</w:t>
       </w:r>
       <w:r>
         <w:rPr>
           <w:rFonts w:cs="Arial"/>
           <w:i/>
           <w:iCs/>
+          <w:lang w:val="es-ES"/>
         </w:rPr>
         <w:t>Encoding</w:t>
       </w:r>
       <w:r>
         <w:rPr>
           <w:rFonts w:cs="Arial"/>
-        </w:rPr>
-        <w:t xml:space="preserve">). En </w:t>
-      </w:r>
-      <w:proofErr w:type="spellStart"/>
-      <w:r>
-        <w:rPr>
-          <w:rFonts w:cs="Arial"/>
-        </w:rPr>
-        <w:t>este</w:t>
-      </w:r>
-      <w:proofErr w:type="spellEnd"/>
-      <w:r>
-        <w:rPr>
-          <w:rFonts w:cs="Arial"/>
-        </w:rPr>
-        <w:t xml:space="preserve"> </w:t>
-      </w:r>
-      <w:proofErr w:type="spellStart"/>
-      <w:r>
-        <w:rPr>
-          <w:rFonts w:cs="Arial"/>
-        </w:rPr>
-        <w:t>laboratorio</w:t>
-      </w:r>
-      <w:proofErr w:type="spellEnd"/>
-      <w:r>
-        <w:rPr>
-          <w:rFonts w:cs="Arial"/>
-        </w:rPr>
-        <w:t xml:space="preserve">, el </w:t>
-      </w:r>
-      <w:proofErr w:type="spellStart"/>
-      <w:r>
-        <w:rPr>
-          <w:rFonts w:cs="Arial"/>
-        </w:rPr>
-        <w:t>temporizador</w:t>
-      </w:r>
-      <w:proofErr w:type="spellEnd"/>
-      <w:r>
-        <w:rPr>
-          <w:rFonts w:cs="Arial"/>
-        </w:rPr>
-        <w:t xml:space="preserve"> </w:t>
-      </w:r>
-      <w:proofErr w:type="spellStart"/>
-      <w:r>
-        <w:rPr>
-          <w:rFonts w:cs="Arial"/>
-        </w:rPr>
-        <w:t>por</w:t>
-      </w:r>
-      <w:proofErr w:type="spellEnd"/>
-      <w:r>
-        <w:rPr>
-          <w:rFonts w:cs="Arial"/>
-        </w:rPr>
-        <w:t xml:space="preserve"> hardware se </w:t>
-      </w:r>
-      <w:proofErr w:type="spellStart"/>
-      <w:r>
-        <w:rPr>
-          <w:rFonts w:cs="Arial"/>
-        </w:rPr>
-        <w:t>configuró</w:t>
-      </w:r>
-      <w:proofErr w:type="spellEnd"/>
-      <w:r>
-        <w:rPr>
-          <w:rFonts w:cs="Arial"/>
-        </w:rPr>
-        <w:t xml:space="preserve"> para </w:t>
-      </w:r>
-      <w:proofErr w:type="spellStart"/>
-      <w:r>
-        <w:rPr>
-          <w:rFonts w:cs="Arial"/>
-        </w:rPr>
-        <w:t>que</w:t>
-      </w:r>
-      <w:proofErr w:type="spellEnd"/>
-      <w:r>
-        <w:rPr>
-          <w:rFonts w:cs="Arial"/>
-        </w:rPr>
-        <w:t xml:space="preserve"> el ADC </w:t>
-      </w:r>
-      <w:proofErr w:type="spellStart"/>
-      <w:r>
-        <w:rPr>
-          <w:rFonts w:cs="Arial"/>
-        </w:rPr>
-        <w:t>muestreara</w:t>
-      </w:r>
-      <w:proofErr w:type="spellEnd"/>
-      <w:r>
-        <w:rPr>
-          <w:rFonts w:cs="Arial"/>
-        </w:rPr>
-        <w:t xml:space="preserve"> la </w:t>
-      </w:r>
-      <w:proofErr w:type="spellStart"/>
-      <w:r>
-        <w:rPr>
-          <w:rFonts w:cs="Arial"/>
-        </w:rPr>
-        <w:t>señal</w:t>
-      </w:r>
-      <w:proofErr w:type="spellEnd"/>
-      <w:r>
-        <w:rPr>
-          <w:rFonts w:cs="Arial"/>
-        </w:rPr>
-        <w:t xml:space="preserve"> </w:t>
-      </w:r>
-      <w:proofErr w:type="spellStart"/>
-      <w:r>
-        <w:rPr>
-          <w:rFonts w:cs="Arial"/>
-        </w:rPr>
-        <w:t>analógica</w:t>
-      </w:r>
-      <w:proofErr w:type="spellEnd"/>
-      <w:r>
-        <w:rPr>
-          <w:rFonts w:cs="Arial"/>
-        </w:rPr>
-        <w:t xml:space="preserve"> a </w:t>
-      </w:r>
-      <w:proofErr w:type="spellStart"/>
-      <w:r>
-        <w:rPr>
-          <w:rFonts w:cs="Arial"/>
-        </w:rPr>
-        <w:t>una</w:t>
-      </w:r>
-      <w:proofErr w:type="spellEnd"/>
-      <w:r>
-        <w:rPr>
-          <w:rFonts w:cs="Arial"/>
-        </w:rPr>
-        <w:t xml:space="preserve"> </w:t>
-      </w:r>
-      <w:proofErr w:type="spellStart"/>
-      <w:r>
-        <w:rPr>
-          <w:rFonts w:cs="Arial"/>
-        </w:rPr>
-        <w:t>frecuencia</w:t>
-      </w:r>
-      <w:proofErr w:type="spellEnd"/>
-      <w:r>
-        <w:rPr>
-          <w:rFonts w:cs="Arial"/>
-        </w:rPr>
-        <w:t xml:space="preserve"> exacta de 20 Hz. </w:t>
-      </w:r>
-      <w:proofErr w:type="spellStart"/>
-      <w:r>
-        <w:rPr>
-          <w:rFonts w:cs="Arial"/>
-        </w:rPr>
-        <w:t>Posteriormente</w:t>
-      </w:r>
-      <w:proofErr w:type="spellEnd"/>
-      <w:r>
-        <w:rPr>
-          <w:rFonts w:cs="Arial"/>
-        </w:rPr>
-        <w:t xml:space="preserve">, la </w:t>
-      </w:r>
-      <w:proofErr w:type="spellStart"/>
-      <w:r>
-        <w:rPr>
-          <w:rFonts w:cs="Arial"/>
-        </w:rPr>
-        <w:t>resolución</w:t>
-      </w:r>
-      <w:proofErr w:type="spellEnd"/>
-      <w:r>
-        <w:rPr>
-          <w:rFonts w:cs="Arial"/>
-        </w:rPr>
-        <w:t xml:space="preserve"> original de 10 bits </w:t>
-      </w:r>
-      <w:proofErr w:type="spellStart"/>
-      <w:r>
-        <w:rPr>
-          <w:rFonts w:cs="Arial"/>
-        </w:rPr>
-        <w:t>generada</w:t>
-      </w:r>
-      <w:proofErr w:type="spellEnd"/>
-      <w:r>
-        <w:rPr>
-          <w:rFonts w:cs="Arial"/>
-        </w:rPr>
-        <w:t xml:space="preserve"> </w:t>
-      </w:r>
-      <w:proofErr w:type="spellStart"/>
-      <w:r>
-        <w:rPr>
-          <w:rFonts w:cs="Arial"/>
-        </w:rPr>
-        <w:t>por</w:t>
-      </w:r>
-      <w:proofErr w:type="spellEnd"/>
-      <w:r>
-        <w:rPr>
-          <w:rFonts w:cs="Arial"/>
-        </w:rPr>
-        <w:t xml:space="preserve"> el ADC se </w:t>
-      </w:r>
-      <w:proofErr w:type="spellStart"/>
-      <w:r>
-        <w:rPr>
-          <w:rFonts w:cs="Arial"/>
-        </w:rPr>
-        <w:t>redujo</w:t>
-      </w:r>
-      <w:proofErr w:type="spellEnd"/>
-      <w:r>
-        <w:rPr>
-          <w:rFonts w:cs="Arial"/>
-        </w:rPr>
-        <w:t xml:space="preserve"> a 4 bits </w:t>
-      </w:r>
-      <w:proofErr w:type="spellStart"/>
-      <w:r>
-        <w:rPr>
-          <w:rFonts w:cs="Arial"/>
-        </w:rPr>
-        <w:t>mediante</w:t>
-      </w:r>
-      <w:proofErr w:type="spellEnd"/>
-      <w:r>
-        <w:rPr>
-          <w:rFonts w:cs="Arial"/>
-        </w:rPr>
-        <w:t xml:space="preserve"> </w:t>
-      </w:r>
-      <w:proofErr w:type="spellStart"/>
-      <w:r>
-        <w:rPr>
-          <w:rFonts w:cs="Arial"/>
-        </w:rPr>
-        <w:t>operaciones</w:t>
-      </w:r>
-      <w:proofErr w:type="spellEnd"/>
-      <w:r>
-        <w:rPr>
-          <w:rFonts w:cs="Arial"/>
-        </w:rPr>
-        <w:t xml:space="preserve"> de </w:t>
-      </w:r>
-      <w:proofErr w:type="spellStart"/>
-      <w:r>
-        <w:rPr>
-          <w:rFonts w:cs="Arial"/>
-        </w:rPr>
-        <w:t>código</w:t>
-      </w:r>
-      <w:proofErr w:type="spellEnd"/>
-      <w:r>
-        <w:rPr>
-          <w:rFonts w:cs="Arial"/>
-        </w:rPr>
-        <w:t xml:space="preserve">, </w:t>
-      </w:r>
-      <w:proofErr w:type="spellStart"/>
-      <w:r>
-        <w:rPr>
-          <w:rFonts w:cs="Arial"/>
-        </w:rPr>
-        <w:t>logrando</w:t>
-      </w:r>
-      <w:proofErr w:type="spellEnd"/>
-      <w:r>
-        <w:rPr>
-          <w:rFonts w:cs="Arial"/>
-        </w:rPr>
-        <w:t xml:space="preserve"> </w:t>
-      </w:r>
-      <w:proofErr w:type="spellStart"/>
-      <w:r>
-        <w:rPr>
-          <w:rFonts w:cs="Arial"/>
-        </w:rPr>
-        <w:t>así</w:t>
-      </w:r>
-      <w:proofErr w:type="spellEnd"/>
-      <w:r>
-        <w:rPr>
-          <w:rFonts w:cs="Arial"/>
-        </w:rPr>
-        <w:t xml:space="preserve"> la </w:t>
-      </w:r>
-      <w:proofErr w:type="spellStart"/>
-      <w:r>
-        <w:rPr>
-          <w:rFonts w:cs="Arial"/>
-        </w:rPr>
-        <w:t>cuantización</w:t>
-      </w:r>
-      <w:proofErr w:type="spellEnd"/>
-      <w:r>
-        <w:rPr>
-          <w:rFonts w:cs="Arial"/>
-        </w:rPr>
-        <w:t xml:space="preserve"> de la </w:t>
-      </w:r>
-      <w:proofErr w:type="spellStart"/>
-      <w:r>
-        <w:rPr>
-          <w:rFonts w:cs="Arial"/>
-        </w:rPr>
-        <w:t>señal</w:t>
-      </w:r>
-      <w:proofErr w:type="spellEnd"/>
-      <w:r>
-        <w:rPr>
-          <w:rFonts w:cs="Arial"/>
-        </w:rPr>
-        <w:t xml:space="preserve"> </w:t>
-      </w:r>
-      <w:proofErr w:type="spellStart"/>
-      <w:r>
-        <w:rPr>
-          <w:rFonts w:cs="Arial"/>
-        </w:rPr>
-        <w:t>en</w:t>
-      </w:r>
-      <w:proofErr w:type="spellEnd"/>
-      <w:r>
-        <w:rPr>
-          <w:rFonts w:cs="Arial"/>
-        </w:rPr>
-        <w:t xml:space="preserve"> 16 </w:t>
-      </w:r>
-      <w:proofErr w:type="spellStart"/>
-      <w:r>
-        <w:rPr>
-          <w:rFonts w:cs="Arial"/>
-        </w:rPr>
-        <w:t>niveles</w:t>
-      </w:r>
-      <w:proofErr w:type="spellEnd"/>
-      <w:r>
-        <w:rPr>
-          <w:rFonts w:cs="Arial"/>
-        </w:rPr>
-        <w:t xml:space="preserve"> </w:t>
-      </w:r>
-      <w:proofErr w:type="spellStart"/>
-      <w:r>
-        <w:rPr>
-          <w:rFonts w:cs="Arial"/>
-        </w:rPr>
-        <w:t>discretos</w:t>
-      </w:r>
-      <w:proofErr w:type="spellEnd"/>
-      <w:r>
-        <w:rPr>
-          <w:rFonts w:cs="Arial"/>
-        </w:rPr>
-        <w:t xml:space="preserve"> y </w:t>
-      </w:r>
-      <w:proofErr w:type="spellStart"/>
-      <w:r>
-        <w:rPr>
-          <w:rFonts w:cs="Arial"/>
-        </w:rPr>
-        <w:t>su</w:t>
-      </w:r>
-      <w:proofErr w:type="spellEnd"/>
-      <w:r>
-        <w:rPr>
-          <w:rFonts w:cs="Arial"/>
-        </w:rPr>
-        <w:t xml:space="preserve"> </w:t>
-      </w:r>
-      <w:proofErr w:type="spellStart"/>
-      <w:r>
-        <w:rPr>
-          <w:rFonts w:cs="Arial"/>
-        </w:rPr>
-        <w:t>codificación</w:t>
-      </w:r>
-      <w:proofErr w:type="spellEnd"/>
-      <w:r>
-        <w:rPr>
-          <w:rFonts w:cs="Arial"/>
-        </w:rPr>
-        <w:t xml:space="preserve"> para la salida </w:t>
-      </w:r>
-      <w:proofErr w:type="spellStart"/>
-      <w:r>
-        <w:rPr>
-          <w:rFonts w:cs="Arial"/>
-        </w:rPr>
-        <w:t>paralela</w:t>
-      </w:r>
-      <w:proofErr w:type="spellEnd"/>
-      <w:r>
-        <w:rPr>
-          <w:rFonts w:cs="Arial"/>
-        </w:rPr>
-        <w:t>.</w:t>
-      </w:r>
-    </w:p>
-    <w:p>
-      <w:pPr>
-        <w:rPr>
-          <w:rFonts w:cs="Arial"/>
+          <w:lang w:val="es-ES"/>
+        </w:rPr>
+        <w:t>). En este laboratorio, el temporizador por hardware se configuró para que el ADC muestreara la señal analógica a una frecuencia exacta de 20 Hz. Posteriormente, la resolución original de 10 bits generada por el ADC se redujo a 4 bits mediante operaciones de código, logrando así la cuantización de la señal en 16 niveles discretos y su codificación para la salida paralela.</w:t>
+      </w:r>
+    </w:p>
+    <w:p>
+      <w:pPr>
+        <w:rPr>
+          <w:rFonts w:cs="Arial"/>
+          <w:lang w:val="es-ES"/>
         </w:rPr>
       </w:pPr>
     </w:p>
@@ -2592,7 +962,7 @@
     </w:p>
     <w:p>
       <w:pPr>
-        <w:pStyle w:val="ListParagraph"/>
+        <w:pStyle w:val="Prrafodelista"/>
         <w:numPr>
           <w:ilvl w:val="0"/>
           <w:numId w:val="6"/>
@@ -2612,7 +982,7 @@
     </w:p>
     <w:p>
       <w:pPr>
-        <w:pStyle w:val="ListParagraph"/>
+        <w:pStyle w:val="Prrafodelista"/>
         <w:numPr>
           <w:ilvl w:val="0"/>
           <w:numId w:val="6"/>
@@ -2632,7 +1002,7 @@
     </w:p>
     <w:p>
       <w:pPr>
-        <w:pStyle w:val="ListParagraph"/>
+        <w:pStyle w:val="Prrafodelista"/>
         <w:numPr>
           <w:ilvl w:val="0"/>
           <w:numId w:val="6"/>
@@ -2666,7 +1036,7 @@
     </w:p>
     <w:p>
       <w:pPr>
-        <w:pStyle w:val="ListParagraph"/>
+        <w:pStyle w:val="Prrafodelista"/>
         <w:numPr>
           <w:ilvl w:val="0"/>
           <w:numId w:val="6"/>
@@ -2686,7 +1056,7 @@
     </w:p>
     <w:p>
       <w:pPr>
-        <w:pStyle w:val="ListParagraph"/>
+        <w:pStyle w:val="Prrafodelista"/>
         <w:numPr>
           <w:ilvl w:val="0"/>
           <w:numId w:val="6"/>
@@ -2706,32 +1076,32 @@
     </w:p>
     <w:p>
       <w:pPr>
-        <w:pStyle w:val="ListParagraph"/>
-        <w:rPr>
-          <w:rFonts w:cs="Arial"/>
-          <w:lang w:val="en-IE"/>
-        </w:rPr>
-      </w:pPr>
-    </w:p>
-    <w:p>
-      <w:pPr>
-        <w:rPr>
-          <w:rFonts w:cs="Arial"/>
-          <w:lang w:val="en-IE"/>
-        </w:rPr>
-      </w:pPr>
-    </w:p>
-    <w:p>
-      <w:pPr>
-        <w:rPr>
-          <w:rFonts w:cs="Arial"/>
-          <w:lang w:val="en-IE"/>
-        </w:rPr>
-      </w:pPr>
-    </w:p>
-    <w:p>
-      <w:pPr>
-        <w:pStyle w:val="Heading1"/>
+        <w:pStyle w:val="Prrafodelista"/>
+        <w:rPr>
+          <w:rFonts w:cs="Arial"/>
+          <w:lang w:val="en-IE"/>
+        </w:rPr>
+      </w:pPr>
+    </w:p>
+    <w:p>
+      <w:pPr>
+        <w:rPr>
+          <w:rFonts w:cs="Arial"/>
+          <w:lang w:val="en-IE"/>
+        </w:rPr>
+      </w:pPr>
+    </w:p>
+    <w:p>
+      <w:pPr>
+        <w:rPr>
+          <w:rFonts w:cs="Arial"/>
+          <w:lang w:val="en-IE"/>
+        </w:rPr>
+      </w:pPr>
+    </w:p>
+    <w:p>
+      <w:pPr>
+        <w:pStyle w:val="Ttulo1"/>
         <w:numPr>
           <w:ilvl w:val="0"/>
           <w:numId w:val="4"/>
@@ -2750,7 +1120,7 @@
     </w:p>
     <w:p>
       <w:pPr>
-        <w:pStyle w:val="ListParagraph"/>
+        <w:pStyle w:val="Prrafodelista"/>
         <w:keepNext/>
         <w:jc w:val="center"/>
         <w:rPr>
@@ -2761,7 +1131,7 @@
     </w:p>
     <w:p>
       <w:pPr>
-        <w:pStyle w:val="ListParagraph"/>
+        <w:pStyle w:val="Prrafodelista"/>
         <w:keepNext/>
         <w:jc w:val="center"/>
       </w:pPr>
@@ -2771,7 +1141,7 @@
           <w:lang w:val="en-IE"/>
         </w:rPr>
         <w:drawing>
-          <wp:inline distT="0" distB="0" distL="0" distR="0" wp14:anchorId="1E60D5D9" wp14:editId="6BD91376">
+          <wp:inline distT="0" distB="0" distL="0" distR="0" wp14:anchorId="1E60D5D9" wp14:editId="5D9BC403">
             <wp:extent cx="4653608" cy="3569368"/>
             <wp:effectExtent l="0" t="0" r="0" b="0"/>
             <wp:docPr id="1664436414" name="Imagen 1"/>
@@ -2786,7 +1156,7 @@
                     <pic:cNvPicPr/>
                   </pic:nvPicPr>
                   <pic:blipFill rotWithShape="1">
-                    <a:blip r:embed="rId8" cstate="print">
+                    <a:blip r:embed="rId9" cstate="print">
                       <a:extLst>
                         <a:ext uri="{28A0092B-C50C-407E-A947-70E740481C1C}">
                           <a14:useLocalDpi xmlns:a14="http://schemas.microsoft.com/office/drawing/2010/main" val="0"/>
@@ -2824,7 +1194,7 @@
     </w:p>
     <w:p>
       <w:pPr>
-        <w:pStyle w:val="Caption"/>
+        <w:pStyle w:val="Descripcin"/>
         <w:jc w:val="center"/>
       </w:pPr>
       <w:r>
@@ -2870,7 +1240,7 @@
           <w:lang w:val="en-IE"/>
         </w:rPr>
         <w:drawing>
-          <wp:inline distT="0" distB="0" distL="0" distR="0" wp14:anchorId="16B32DDF" wp14:editId="0BF908F3">
+          <wp:inline distT="0" distB="0" distL="0" distR="0" wp14:anchorId="16B32DDF" wp14:editId="6DBF43DF">
             <wp:extent cx="4531094" cy="3328168"/>
             <wp:effectExtent l="0" t="0" r="3175" b="5715"/>
             <wp:docPr id="948671269" name="Imagen 2"/>
@@ -2885,7 +1255,7 @@
                     <pic:cNvPicPr/>
                   </pic:nvPicPr>
                   <pic:blipFill rotWithShape="1">
-                    <a:blip r:embed="rId9" cstate="print">
+                    <a:blip r:embed="rId10" cstate="print">
                       <a:extLst>
                         <a:ext uri="{28A0092B-C50C-407E-A947-70E740481C1C}">
                           <a14:useLocalDpi xmlns:a14="http://schemas.microsoft.com/office/drawing/2010/main" val="0"/>
@@ -2923,7 +1293,7 @@
     </w:p>
     <w:p>
       <w:pPr>
-        <w:pStyle w:val="Caption"/>
+        <w:pStyle w:val="Descripcin"/>
         <w:jc w:val="center"/>
       </w:pPr>
       <w:r>
@@ -2960,7 +1330,7 @@
     </w:p>
     <w:p>
       <w:pPr>
-        <w:pStyle w:val="Heading1"/>
+        <w:pStyle w:val="Ttulo1"/>
         <w:numPr>
           <w:ilvl w:val="0"/>
           <w:numId w:val="4"/>
@@ -2978,787 +1348,972 @@
       </w:r>
     </w:p>
     <w:p>
-      <w:pPr>
-        <w:rPr>
-          <w:lang w:val="en-IE"/>
-        </w:rPr>
-      </w:pPr>
-    </w:p>
-    <w:p>
-      <w:pPr>
-        <w:rPr>
-          <w:lang w:val="en-IE"/>
-        </w:rPr>
-      </w:pPr>
-      <w:r>
-        <w:rPr>
+      <w:r>
+        <w:t xml:space="preserve">During this phase of the </w:t>
+      </w:r>
+      <w:r>
+        <w:t>practice</w:t>
+      </w:r>
+      <w:r>
+        <w:t xml:space="preserve">, the necessary hardware configuration and sampling routines were established to process the generated signal. </w:t>
+      </w:r>
+    </w:p>
+    <w:p>
+      <w:r>
+        <w:t>Initially, the microcontroller's pins P1.0, P1.1, P1.2, and P1.3 were configured as outputs, while pin P1.4 was exclusively designated as the</w:t>
+      </w:r>
+      <w:r>
+        <w:t xml:space="preserve"> </w:t>
+      </w:r>
+      <w:r>
+        <w:t xml:space="preserve">input for the ADC. This setup allows the digital data to be transmitted in a 4-bit parallel form. </w:t>
+      </w:r>
+      <w:r>
+        <w:t>Furthermore</w:t>
+      </w:r>
+      <w:r>
+        <w:t xml:space="preserve">, the 10-bit ADC was initialized and configured to accurately capture the incoming analogue signal on pin P1.4. </w:t>
+      </w:r>
+    </w:p>
+    <w:p>
+      <w:r>
+        <w:t>Finally, the internal hardware</w:t>
+      </w:r>
+      <w:r>
+        <w:t>,</w:t>
+      </w:r>
+      <w:r>
+        <w:t xml:space="preserve"> Timer A</w:t>
+      </w:r>
+      <w:r>
+        <w:t>,</w:t>
+      </w:r>
+      <w:r>
+        <w:t xml:space="preserve"> was configured to establish a precise sampling rate of 20 Hz.</w:t>
+      </w:r>
+    </w:p>
+    <w:p/>
+    <w:p>
+      <w:pPr>
+        <w:keepNext/>
+        <w:jc w:val="center"/>
+      </w:pPr>
+      <w:r>
+        <w:rPr>
+          <w:lang w:val="en-IE"/>
+        </w:rPr>
+        <w:drawing>
+          <wp:inline distT="0" distB="0" distL="0" distR="0" wp14:anchorId="24550A54" wp14:editId="10ED583F">
+            <wp:extent cx="3627120" cy="4227119"/>
+            <wp:effectExtent l="0" t="0" r="0" b="2540"/>
+            <wp:docPr id="499506005" name="Imagen 1"/>
+            <wp:cNvGraphicFramePr>
+              <a:graphicFrameLocks xmlns:a="http://schemas.openxmlformats.org/drawingml/2006/main" noChangeAspect="1"/>
+            </wp:cNvGraphicFramePr>
+            <a:graphic xmlns:a="http://schemas.openxmlformats.org/drawingml/2006/main">
+              <a:graphicData uri="http://schemas.openxmlformats.org/drawingml/2006/picture">
+                <pic:pic xmlns:pic="http://schemas.openxmlformats.org/drawingml/2006/picture">
+                  <pic:nvPicPr>
+                    <pic:cNvPr id="499506005" name=""/>
+                    <pic:cNvPicPr/>
+                  </pic:nvPicPr>
+                  <pic:blipFill rotWithShape="1">
+                    <a:blip r:embed="rId11"/>
+                    <a:srcRect l="35000"/>
+                    <a:stretch>
+                      <a:fillRect/>
+                    </a:stretch>
+                  </pic:blipFill>
+                  <pic:spPr bwMode="auto">
+                    <a:xfrm>
+                      <a:off x="0" y="0"/>
+                      <a:ext cx="3628488" cy="4228713"/>
+                    </a:xfrm>
+                    <a:prstGeom prst="rect">
+                      <a:avLst/>
+                    </a:prstGeom>
+                    <a:ln>
+                      <a:noFill/>
+                    </a:ln>
+                    <a:extLst>
+                      <a:ext uri="{53640926-AAD7-44D8-BBD7-CCE9431645EC}">
+                        <a14:shadowObscured xmlns:a14="http://schemas.microsoft.com/office/drawing/2010/main"/>
+                      </a:ext>
+                    </a:extLst>
+                  </pic:spPr>
+                </pic:pic>
+              </a:graphicData>
+            </a:graphic>
+          </wp:inline>
+        </w:drawing>
+      </w:r>
+    </w:p>
+    <w:p>
+      <w:pPr>
+        <w:pStyle w:val="Descripcin"/>
+        <w:jc w:val="center"/>
+        <w:rPr>
+          <w:lang w:val="en-IE"/>
+        </w:rPr>
+      </w:pPr>
+      <w:r>
+        <w:t xml:space="preserve">Figure </w:t>
+      </w:r>
+      <w:r>
+        <w:fldChar w:fldCharType="begin"/>
+      </w:r>
+      <w:r>
+        <w:instrText xml:space="preserve"> SEQ Figure \* ARABIC </w:instrText>
+      </w:r>
+      <w:r>
+        <w:fldChar w:fldCharType="separate"/>
+      </w:r>
+      <w:r>
+        <w:rPr>
+          <w:noProof/>
+        </w:rPr>
+        <w:t>3</w:t>
+      </w:r>
+      <w:r>
+        <w:fldChar w:fldCharType="end"/>
+      </w:r>
+      <w:r>
+        <w:t>: Code in Code</w:t>
+      </w:r>
+      <w:r>
+        <w:t xml:space="preserve"> </w:t>
+      </w:r>
+      <w:r>
+        <w:t>Composer</w:t>
+      </w:r>
+      <w:r>
+        <w:t xml:space="preserve"> Studio</w:t>
+      </w:r>
+    </w:p>
+    <w:p>
+      <w:pPr>
+        <w:pStyle w:val="Ttulo1"/>
+        <w:numPr>
+          <w:ilvl w:val="0"/>
+          <w:numId w:val="4"/>
+        </w:numPr>
+        <w:rPr>
+          <w:lang w:val="en-IE"/>
+        </w:rPr>
+      </w:pPr>
+      <w:r>
+        <w:rPr>
+          <w:lang w:val="en-IE"/>
+        </w:rPr>
+        <w:t>Quantization and Encoding of the signal:</w:t>
+      </w:r>
+    </w:p>
+    <w:p>
+      <w:pPr>
+        <w:rPr>
+          <w:lang w:val="en-IE"/>
+        </w:rPr>
+      </w:pPr>
+    </w:p>
+    <w:p>
+      <w:r>
+        <w:t xml:space="preserve">Using the code described in the previous paragraph, different voltages (0, 1, 2, and 3 V) were tested, thereby verifying that the theoretical values calculated in Figure </w:t>
+      </w:r>
+      <w:r>
+        <w:t>4</w:t>
+      </w:r>
+      <w:r>
+        <w:t xml:space="preserve"> were correct. For this purpose, the signal from the signal generator was connected to </w:t>
+      </w:r>
+      <w:r>
+        <w:t>pin</w:t>
+      </w:r>
+      <w:r>
+        <w:t xml:space="preserve"> P1.4 of the MSP430. </w:t>
+      </w:r>
+      <w:r>
+        <w:t>Once processed, the microcontroller output</w:t>
+      </w:r>
+      <w:r>
+        <w:t xml:space="preserve">s </w:t>
+      </w:r>
+      <w:r>
+        <w:t xml:space="preserve">the corresponding numerical value in binary through </w:t>
+      </w:r>
+      <w:r>
+        <w:t>pins</w:t>
+      </w:r>
+      <w:r>
+        <w:t xml:space="preserve"> P1.0 - P1.3, with P1.0 being the LSB and P1.3 the MSB. One final interesting detail learned during this part of the practical is that using the MP750510 signal generator does </w:t>
+      </w:r>
+      <w:r>
+        <w:lastRenderedPageBreak/>
+        <w:t>not yield consistent results due to how this device operates, as its signal is not constant. On the other hand, the EL302Tv signal generator did allow for generating the signal correctly, as it generates a constant signal.</w:t>
+      </w:r>
+    </w:p>
+    <w:p>
+      <w:pPr>
+        <w:rPr>
+          <w:lang w:val="en-GB"/>
+        </w:rPr>
+      </w:pPr>
+    </w:p>
+    <w:p>
+      <w:pPr>
+        <w:keepNext/>
+        <w:jc w:val="center"/>
+      </w:pPr>
+      <w:r>
+        <w:rPr>
+          <w:noProof/>
+          <w:lang w:val="en-IE"/>
+        </w:rPr>
+        <w:drawing>
+          <wp:inline distT="0" distB="0" distL="0" distR="0" wp14:anchorId="040A22AB" wp14:editId="2FFF5608">
+            <wp:extent cx="3962400" cy="4535631"/>
+            <wp:effectExtent l="0" t="0" r="0" b="0"/>
+            <wp:docPr id="2078802847" name="Imagen 1"/>
+            <wp:cNvGraphicFramePr>
+              <a:graphicFrameLocks xmlns:a="http://schemas.openxmlformats.org/drawingml/2006/main" noChangeAspect="1"/>
+            </wp:cNvGraphicFramePr>
+            <a:graphic xmlns:a="http://schemas.openxmlformats.org/drawingml/2006/main">
+              <a:graphicData uri="http://schemas.openxmlformats.org/drawingml/2006/picture">
+                <pic:pic xmlns:pic="http://schemas.openxmlformats.org/drawingml/2006/picture">
+                  <pic:nvPicPr>
+                    <pic:cNvPr id="2078802847" name="Imagen 2078802847"/>
+                    <pic:cNvPicPr/>
+                  </pic:nvPicPr>
+                  <pic:blipFill rotWithShape="1">
+                    <a:blip r:embed="rId12" cstate="print">
+                      <a:extLst>
+                        <a:ext uri="{28A0092B-C50C-407E-A947-70E740481C1C}">
+                          <a14:useLocalDpi xmlns:a14="http://schemas.microsoft.com/office/drawing/2010/main" val="0"/>
+                        </a:ext>
+                      </a:extLst>
+                    </a:blip>
+                    <a:srcRect r="34225"/>
+                    <a:stretch>
+                      <a:fillRect/>
+                    </a:stretch>
+                  </pic:blipFill>
+                  <pic:spPr bwMode="auto">
+                    <a:xfrm flipH="1" flipV="1">
+                      <a:off x="0" y="0"/>
+                      <a:ext cx="3967935" cy="4541967"/>
+                    </a:xfrm>
+                    <a:prstGeom prst="rect">
+                      <a:avLst/>
+                    </a:prstGeom>
+                    <a:ln>
+                      <a:noFill/>
+                    </a:ln>
+                    <a:extLst>
+                      <a:ext uri="{53640926-AAD7-44D8-BBD7-CCE9431645EC}">
+                        <a14:shadowObscured xmlns:a14="http://schemas.microsoft.com/office/drawing/2010/main"/>
+                      </a:ext>
+                    </a:extLst>
+                  </pic:spPr>
+                </pic:pic>
+              </a:graphicData>
+            </a:graphic>
+          </wp:inline>
+        </w:drawing>
+      </w:r>
+    </w:p>
+    <w:p>
+      <w:pPr>
+        <w:pStyle w:val="Descripcin"/>
+        <w:jc w:val="center"/>
+        <w:rPr>
+          <w:lang w:val="en-IE"/>
+        </w:rPr>
+      </w:pPr>
+      <w:r>
+        <w:t xml:space="preserve">Figure </w:t>
+      </w:r>
+      <w:r>
+        <w:fldChar w:fldCharType="begin"/>
+      </w:r>
+      <w:r>
+        <w:instrText xml:space="preserve"> SEQ Figure \* ARABIC </w:instrText>
+      </w:r>
+      <w:r>
+        <w:fldChar w:fldCharType="separate"/>
+      </w:r>
+      <w:r>
+        <w:rPr>
+          <w:noProof/>
+        </w:rPr>
+        <w:t>4</w:t>
+      </w:r>
+      <w:r>
+        <w:fldChar w:fldCharType="end"/>
+      </w:r>
+      <w:r>
+        <w:t>: Calculation of theorical values</w:t>
+      </w:r>
+    </w:p>
+    <w:p>
+      <w:pPr>
+        <w:rPr>
+          <w:lang w:val="en-IE"/>
+        </w:rPr>
+      </w:pPr>
+      <w:r>
+        <w:rPr>
+          <w:lang w:val="en-IE"/>
+        </w:rPr>
+        <w:t>To sum up:</w:t>
+      </w:r>
+    </w:p>
+    <w:p>
+      <w:pPr>
+        <w:rPr>
+          <w:lang w:val="en-GB"/>
+        </w:rPr>
+      </w:pPr>
+      <w:r>
+        <w:rPr>
+          <w:lang w:val="en-GB"/>
+        </w:rPr>
+        <w:t>0V</w:t>
+      </w:r>
+      <w:r>
+        <w:rPr>
+          <w:lang w:val="en-GB"/>
+        </w:rPr>
+        <w:t xml:space="preserve">: </w:t>
+      </w:r>
+      <w:r>
+        <w:rPr>
+          <w:lang w:val="en-GB"/>
+        </w:rPr>
+        <w:t>0000</w:t>
+      </w:r>
+    </w:p>
+    <w:p>
+      <w:pPr>
+        <w:rPr>
+          <w:lang w:val="en-GB"/>
+        </w:rPr>
+      </w:pPr>
+      <w:r>
+        <w:rPr>
+          <w:lang w:val="en-GB"/>
+        </w:rPr>
+        <w:t>1V</w:t>
+      </w:r>
+      <w:r>
+        <w:rPr>
+          <w:lang w:val="en-GB"/>
+        </w:rPr>
+        <w:t xml:space="preserve">: </w:t>
+      </w:r>
+      <w:r>
+        <w:rPr>
+          <w:lang w:val="en-GB"/>
+        </w:rPr>
+        <w:t>0100</w:t>
+      </w:r>
+    </w:p>
+    <w:p>
+      <w:pPr>
+        <w:rPr>
+          <w:lang w:val="en-GB"/>
+        </w:rPr>
+      </w:pPr>
+      <w:r>
+        <w:rPr>
+          <w:lang w:val="en-GB"/>
+        </w:rPr>
+        <w:t>2V</w:t>
+      </w:r>
+      <w:r>
+        <w:rPr>
+          <w:lang w:val="en-GB"/>
+        </w:rPr>
+        <w:t xml:space="preserve">: </w:t>
+      </w:r>
+      <w:r>
+        <w:rPr>
+          <w:lang w:val="en-GB"/>
+        </w:rPr>
+        <w:t>1001</w:t>
+      </w:r>
+    </w:p>
+    <w:p>
+      <w:pPr>
+        <w:rPr>
+          <w:lang w:val="es-ES"/>
+        </w:rPr>
+      </w:pPr>
+      <w:r>
+        <w:rPr>
+          <w:lang w:val="es-ES"/>
+        </w:rPr>
+        <w:t>3V</w:t>
+      </w:r>
+      <w:r>
+        <w:rPr>
+          <w:lang w:val="es-ES"/>
+        </w:rPr>
+        <w:t xml:space="preserve">: </w:t>
+      </w:r>
+      <w:r>
+        <w:rPr>
+          <w:lang w:val="es-ES"/>
+        </w:rPr>
+        <w:t>1110</w:t>
+      </w:r>
+    </w:p>
+    <w:p>
+      <w:pPr>
+        <w:rPr>
+          <w:lang w:val="es-ES"/>
+        </w:rPr>
+      </w:pPr>
+    </w:p>
+    <w:p>
+      <w:pPr>
+        <w:rPr>
+          <w:lang w:val="es-ES"/>
+        </w:rPr>
+      </w:pPr>
+    </w:p>
+    <w:p>
+      <w:pPr>
+        <w:keepNext/>
+        <w:jc w:val="center"/>
+      </w:pPr>
+      <w:r>
+        <w:rPr>
+          <w:noProof/>
+          <w:lang w:val="es-ES"/>
+        </w:rPr>
+        <w:lastRenderedPageBreak/>
+        <w:drawing>
+          <wp:inline distT="0" distB="0" distL="0" distR="0" wp14:anchorId="784A69E2" wp14:editId="09478B5E">
+            <wp:extent cx="3862155" cy="2907792"/>
+            <wp:effectExtent l="0" t="0" r="5080" b="6985"/>
+            <wp:docPr id="486079767" name="Imagen 2"/>
+            <wp:cNvGraphicFramePr>
+              <a:graphicFrameLocks xmlns:a="http://schemas.openxmlformats.org/drawingml/2006/main" noChangeAspect="1"/>
+            </wp:cNvGraphicFramePr>
+            <a:graphic xmlns:a="http://schemas.openxmlformats.org/drawingml/2006/main">
+              <a:graphicData uri="http://schemas.openxmlformats.org/drawingml/2006/picture">
+                <pic:pic xmlns:pic="http://schemas.openxmlformats.org/drawingml/2006/picture">
+                  <pic:nvPicPr>
+                    <pic:cNvPr id="486079767" name="Imagen 486079767"/>
+                    <pic:cNvPicPr/>
+                  </pic:nvPicPr>
+                  <pic:blipFill>
+                    <a:blip r:embed="rId13" cstate="print">
+                      <a:extLst>
+                        <a:ext uri="{28A0092B-C50C-407E-A947-70E740481C1C}">
+                          <a14:useLocalDpi xmlns:a14="http://schemas.microsoft.com/office/drawing/2010/main" val="0"/>
+                        </a:ext>
+                      </a:extLst>
+                    </a:blip>
+                    <a:stretch>
+                      <a:fillRect/>
+                    </a:stretch>
+                  </pic:blipFill>
+                  <pic:spPr>
+                    <a:xfrm>
+                      <a:off x="0" y="0"/>
+                      <a:ext cx="3877896" cy="2919644"/>
+                    </a:xfrm>
+                    <a:prstGeom prst="rect">
+                      <a:avLst/>
+                    </a:prstGeom>
+                  </pic:spPr>
+                </pic:pic>
+              </a:graphicData>
+            </a:graphic>
+          </wp:inline>
+        </w:drawing>
+      </w:r>
+    </w:p>
+    <w:p>
+      <w:pPr>
+        <w:pStyle w:val="Descripcin"/>
+        <w:jc w:val="center"/>
+      </w:pPr>
+      <w:r>
+        <w:t xml:space="preserve">Figure </w:t>
+      </w:r>
+      <w:r>
+        <w:fldChar w:fldCharType="begin"/>
+      </w:r>
+      <w:r>
+        <w:instrText xml:space="preserve"> SEQ Figure \* ARABIC </w:instrText>
+      </w:r>
+      <w:r>
+        <w:fldChar w:fldCharType="separate"/>
+      </w:r>
+      <w:r>
+        <w:rPr>
+          <w:noProof/>
+        </w:rPr>
+        <w:t>5</w:t>
+      </w:r>
+      <w:r>
+        <w:fldChar w:fldCharType="end"/>
+      </w:r>
+      <w:r>
+        <w:t>: Measure of P1.0 with 3.3V in P1.4</w:t>
+      </w:r>
+    </w:p>
+    <w:p>
+      <w:pPr>
+        <w:rPr>
+          <w:lang w:val="en-GB"/>
+        </w:rPr>
+      </w:pPr>
+    </w:p>
+    <w:p>
+      <w:pPr>
+        <w:pStyle w:val="Ttulo1"/>
+        <w:numPr>
+          <w:ilvl w:val="0"/>
+          <w:numId w:val="4"/>
+        </w:numPr>
+      </w:pPr>
+      <w:r>
+        <w:t>Discrete DAC Hardware Reconstruction</w:t>
+      </w:r>
+    </w:p>
+    <w:p>
+      <w:r>
+        <w:t>The final phase of the practical involved converting the digital signal back into an analogue waveform that resembled the original input. To achieve this Digital-to-Analogue Conversion (DAC), a 4-channel summing amplifier circuit was constructed on a breadboard.</w:t>
+      </w:r>
+    </w:p>
+    <w:p/>
+    <w:p>
+      <w:pPr>
+        <w:keepNext/>
+        <w:jc w:val="center"/>
+      </w:pPr>
+      <w:r>
+        <w:rPr>
+          <w:noProof/>
+        </w:rPr>
+        <w:drawing>
+          <wp:inline distT="0" distB="0" distL="0" distR="0" wp14:anchorId="5B9292C6" wp14:editId="26B9556F">
+            <wp:extent cx="3652875" cy="2750226"/>
+            <wp:effectExtent l="0" t="0" r="5080" b="0"/>
+            <wp:docPr id="1495892355" name="Imagen 3"/>
+            <wp:cNvGraphicFramePr>
+              <a:graphicFrameLocks xmlns:a="http://schemas.openxmlformats.org/drawingml/2006/main" noChangeAspect="1"/>
+            </wp:cNvGraphicFramePr>
+            <a:graphic xmlns:a="http://schemas.openxmlformats.org/drawingml/2006/main">
+              <a:graphicData uri="http://schemas.openxmlformats.org/drawingml/2006/picture">
+                <pic:pic xmlns:pic="http://schemas.openxmlformats.org/drawingml/2006/picture">
+                  <pic:nvPicPr>
+                    <pic:cNvPr id="1495892355" name="Imagen 1495892355"/>
+                    <pic:cNvPicPr/>
+                  </pic:nvPicPr>
+                  <pic:blipFill>
+                    <a:blip r:embed="rId14" cstate="print">
+                      <a:extLst>
+                        <a:ext uri="{28A0092B-C50C-407E-A947-70E740481C1C}">
+                          <a14:useLocalDpi xmlns:a14="http://schemas.microsoft.com/office/drawing/2010/main" val="0"/>
+                        </a:ext>
+                      </a:extLst>
+                    </a:blip>
+                    <a:stretch>
+                      <a:fillRect/>
+                    </a:stretch>
+                  </pic:blipFill>
+                  <pic:spPr>
+                    <a:xfrm>
+                      <a:off x="0" y="0"/>
+                      <a:ext cx="3680059" cy="2770692"/>
+                    </a:xfrm>
+                    <a:prstGeom prst="rect">
+                      <a:avLst/>
+                    </a:prstGeom>
+                  </pic:spPr>
+                </pic:pic>
+              </a:graphicData>
+            </a:graphic>
+          </wp:inline>
+        </w:drawing>
+      </w:r>
+    </w:p>
+    <w:p>
+      <w:pPr>
+        <w:pStyle w:val="Descripcin"/>
+        <w:jc w:val="center"/>
+      </w:pPr>
+      <w:r>
+        <w:t xml:space="preserve">Figure </w:t>
+      </w:r>
+      <w:r>
+        <w:fldChar w:fldCharType="begin"/>
+      </w:r>
+      <w:r>
+        <w:instrText xml:space="preserve"> SEQ Figure \* ARABIC </w:instrText>
+      </w:r>
+      <w:r>
+        <w:fldChar w:fldCharType="separate"/>
+      </w:r>
+      <w:r>
+        <w:rPr>
+          <w:noProof/>
+        </w:rPr>
+        <w:t>6</w:t>
+      </w:r>
+      <w:r>
+        <w:fldChar w:fldCharType="end"/>
+      </w:r>
+      <w:r>
+        <w:t>: Summing Amplifier</w:t>
+      </w:r>
+    </w:p>
+    <w:p>
+      <w:pPr>
+        <w:rPr>
+          <w:lang w:val="es-ES"/>
+        </w:rPr>
+      </w:pPr>
+      <w:r>
+        <w:rPr>
+          <w:lang w:val="es-ES"/>
+        </w:rPr>
+        <w:t xml:space="preserve">La fase final de la práctica consistió en convertir la señal digital de vuelta a una forma de onda analógica que se asemejara a la entrada original. Para lograr esta conversión digital a analógica (DAC), se construyó un circuito amplificador </w:t>
+      </w:r>
+      <w:r>
+        <w:rPr>
+          <w:lang w:val="es-ES"/>
+        </w:rPr>
+        <w:lastRenderedPageBreak/>
+        <w:t xml:space="preserve">sumador de 4 canales utilizando operacionales UA741 en una protoboard. Durante la fase de pruebas, la señal analógica reconstruida se capturó con el osciloscopio (ver Figura </w:t>
+      </w:r>
+      <w:r>
+        <w:rPr>
+          <w:lang w:val="es-ES"/>
+        </w:rPr>
+        <w:t>7</w:t>
+      </w:r>
+      <w:r>
+        <w:rPr>
+          <w:lang w:val="es-ES"/>
+        </w:rPr>
+        <w:t>). La onda resultante mostró el esperado efecto de cuantización en forma de escalera, validando el principio fundamental de la conversión. Sin embargo, la señal no exhibió los 16 niveles discretos de voltaje que corresponden a la resolución de 4 bits del sistema. En su lugar, se observó una forma de onda con escalones significativamente más grandes y una menor cantidad total de niveles. Esta limitación se atribuye a dos posibles fuentes de error experimentales</w:t>
+      </w:r>
+      <w:r>
+        <w:rPr>
+          <w:lang w:val="es-ES"/>
+        </w:rPr>
+        <w:t>,</w:t>
+      </w:r>
+      <w:r>
+        <w:rPr>
+          <w:lang w:val="es-ES"/>
+        </w:rPr>
+        <w:t xml:space="preserve"> </w:t>
+      </w:r>
+      <w:r>
+        <w:rPr>
+          <w:lang w:val="es-ES"/>
+        </w:rPr>
+        <w:t>una amplitud insuficiente en la señal analógica de entrada que no logró abarcar el rango dinámico completo de 0 a 3V del ADC, o un fallo de conexión física en la protoboard (como un mal contacto en el pin del bit menos significativo, LSB), lo cual habría forzado al DAC a operar con una resolución efectiva inferior, similar a un sistema de 3 bits u 8 niveles.</w:t>
+      </w:r>
+    </w:p>
+    <w:p>
+      <w:pPr>
+        <w:rPr>
+          <w:lang w:val="es-ES"/>
+        </w:rPr>
+      </w:pPr>
+    </w:p>
+    <w:p>
+      <w:pPr>
+        <w:keepNext/>
+        <w:jc w:val="center"/>
+      </w:pPr>
+      <w:r>
+        <w:rPr>
+          <w:noProof/>
+          <w:lang w:val="es-ES"/>
+        </w:rPr>
+        <w:drawing>
+          <wp:inline distT="0" distB="0" distL="0" distR="0" wp14:anchorId="0C55DD63" wp14:editId="28AADBE2">
+            <wp:extent cx="5485130" cy="3733517"/>
+            <wp:effectExtent l="0" t="0" r="1270" b="635"/>
+            <wp:docPr id="1299820759" name="Imagen 4"/>
+            <wp:cNvGraphicFramePr>
+              <a:graphicFrameLocks xmlns:a="http://schemas.openxmlformats.org/drawingml/2006/main" noChangeAspect="1"/>
+            </wp:cNvGraphicFramePr>
+            <a:graphic xmlns:a="http://schemas.openxmlformats.org/drawingml/2006/main">
+              <a:graphicData uri="http://schemas.openxmlformats.org/drawingml/2006/picture">
+                <pic:pic xmlns:pic="http://schemas.openxmlformats.org/drawingml/2006/picture">
+                  <pic:nvPicPr>
+                    <pic:cNvPr id="1299820759" name="Imagen 1299820759"/>
+                    <pic:cNvPicPr/>
+                  </pic:nvPicPr>
+                  <pic:blipFill rotWithShape="1">
+                    <a:blip r:embed="rId15" cstate="print">
+                      <a:extLst>
+                        <a:ext uri="{28A0092B-C50C-407E-A947-70E740481C1C}">
+                          <a14:useLocalDpi xmlns:a14="http://schemas.microsoft.com/office/drawing/2010/main" val="0"/>
+                        </a:ext>
+                      </a:extLst>
+                    </a:blip>
+                    <a:srcRect l="-382" t="169" r="382" b="9425"/>
+                    <a:stretch>
+                      <a:fillRect/>
+                    </a:stretch>
+                  </pic:blipFill>
+                  <pic:spPr bwMode="auto">
+                    <a:xfrm>
+                      <a:off x="0" y="0"/>
+                      <a:ext cx="5486400" cy="3734381"/>
+                    </a:xfrm>
+                    <a:prstGeom prst="rect">
+                      <a:avLst/>
+                    </a:prstGeom>
+                    <a:ln>
+                      <a:noFill/>
+                    </a:ln>
+                    <a:extLst>
+                      <a:ext uri="{53640926-AAD7-44D8-BBD7-CCE9431645EC}">
+                        <a14:shadowObscured xmlns:a14="http://schemas.microsoft.com/office/drawing/2010/main"/>
+                      </a:ext>
+                    </a:extLst>
+                  </pic:spPr>
+                </pic:pic>
+              </a:graphicData>
+            </a:graphic>
+          </wp:inline>
+        </w:drawing>
+      </w:r>
+    </w:p>
+    <w:p>
+      <w:pPr>
+        <w:pStyle w:val="Descripcin"/>
+        <w:jc w:val="center"/>
+        <w:rPr>
+          <w:lang w:val="es-ES"/>
+        </w:rPr>
+      </w:pPr>
+      <w:r>
+        <w:t xml:space="preserve">Figure </w:t>
+      </w:r>
+      <w:r>
+        <w:fldChar w:fldCharType="begin"/>
+      </w:r>
+      <w:r>
+        <w:instrText xml:space="preserve"> SEQ Figure \* ARABIC </w:instrText>
+      </w:r>
+      <w:r>
+        <w:fldChar w:fldCharType="separate"/>
+      </w:r>
+      <w:r>
+        <w:rPr>
+          <w:noProof/>
+        </w:rPr>
+        <w:t>7</w:t>
+      </w:r>
+      <w:r>
+        <w:fldChar w:fldCharType="end"/>
+      </w:r>
+      <w:r>
+        <w:t>: Reconstructed Signal</w:t>
+      </w:r>
+    </w:p>
+    <w:p>
+      <w:pPr>
+        <w:rPr>
+          <w:lang w:val="es-ES"/>
+        </w:rPr>
+      </w:pPr>
+      <w:r>
+        <w:rPr>
+          <w:lang w:val="es-ES"/>
+        </w:rPr>
+        <w:t xml:space="preserve">PARTE 4. DIBUJAR COMO SE VERIA CON LOS 16 NIVELES. Y EXPLICAR QUE LA RAZON PRINICIPAL POR LA QUE NO FUNCIONA ES POR UN MAL CABLEADO DENTRO DE </w:t>
+      </w:r>
+      <w:r>
+        <w:rPr>
+          <w:lang w:val="es-ES"/>
+        </w:rPr>
+        <w:t>LA BREADBOARD</w:t>
+      </w:r>
+    </w:p>
+    <w:p>
+      <w:pPr>
+        <w:rPr>
+          <w:lang w:val="es-ES"/>
+        </w:rPr>
+      </w:pPr>
+    </w:p>
+    <w:p>
+      <w:pPr>
+        <w:pStyle w:val="Ttulo1"/>
+        <w:rPr>
+          <w:lang w:val="en-IE"/>
+        </w:rPr>
+      </w:pPr>
+      <w:r>
+        <w:rPr>
+          <w:lang w:val="en-IE"/>
+        </w:rPr>
+        <w:t xml:space="preserve">5. </w:t>
+      </w:r>
+      <w:r>
+        <w:rPr>
+          <w:lang w:val="en-IE"/>
+        </w:rPr>
+        <w:t>Analysis and Questions</w:t>
+      </w:r>
+    </w:p>
+    <w:p>
+      <w:pPr>
+        <w:rPr>
+          <w:rFonts w:cs="Arial"/>
+          <w:lang w:val="en-IE"/>
+        </w:rPr>
+      </w:pPr>
+    </w:p>
+    <w:p>
+      <w:pPr>
+        <w:rPr>
+          <w:rFonts w:cs="Arial"/>
+          <w:lang w:val="en-IE"/>
+        </w:rPr>
+      </w:pPr>
+      <w:r>
+        <w:rPr>
+          <w:rFonts w:cs="Arial"/>
           <w:b/>
           <w:bCs/>
           <w:lang w:val="en-IE"/>
         </w:rPr>
-        <w:t>0V</w:t>
-      </w:r>
-      <w:r>
-        <w:rPr>
-          <w:lang w:val="en-IE"/>
-        </w:rPr>
-        <w:t xml:space="preserve"> </w:t>
-      </w:r>
-      <w:proofErr w:type="spellStart"/>
-      <w:r>
-        <w:rPr>
-          <w:lang w:val="en-IE"/>
-        </w:rPr>
-        <w:t>en</w:t>
-      </w:r>
-      <w:proofErr w:type="spellEnd"/>
-      <w:r>
-        <w:rPr>
-          <w:lang w:val="en-IE"/>
-        </w:rPr>
-        <w:t xml:space="preserve"> P1.4 → Salida </w:t>
-      </w:r>
-      <w:r>
-        <w:rPr>
+        <w:t>Question</w:t>
+      </w:r>
+      <w:r>
+        <w:rPr>
+          <w:rFonts w:cs="Arial"/>
           <w:b/>
           <w:bCs/>
           <w:lang w:val="en-IE"/>
         </w:rPr>
-        <w:t>0000</w:t>
-      </w:r>
-    </w:p>
-    <w:p>
-      <w:pPr>
-        <w:rPr>
-          <w:lang w:val="en-IE"/>
-        </w:rPr>
-      </w:pPr>
-      <w:r>
-        <w:rPr>
+        <w:t xml:space="preserve"> 1</w:t>
+      </w:r>
+      <w:r>
+        <w:rPr>
+          <w:rFonts w:cs="Arial"/>
           <w:b/>
           <w:bCs/>
           <w:lang w:val="en-IE"/>
         </w:rPr>
-        <w:t>1V</w:t>
-      </w:r>
-      <w:r>
-        <w:rPr>
-          <w:lang w:val="en-IE"/>
-        </w:rPr>
-        <w:t xml:space="preserve"> </w:t>
-      </w:r>
-      <w:proofErr w:type="spellStart"/>
-      <w:r>
-        <w:rPr>
-          <w:lang w:val="en-IE"/>
-        </w:rPr>
-        <w:t>en</w:t>
-      </w:r>
-      <w:proofErr w:type="spellEnd"/>
-      <w:r>
-        <w:rPr>
-          <w:lang w:val="en-IE"/>
-        </w:rPr>
-        <w:t xml:space="preserve"> P1.4 → Salida </w:t>
-      </w:r>
-      <w:r>
-        <w:rPr>
+        <w:t xml:space="preserve">: </w:t>
+      </w:r>
+      <w:r>
+        <w:rPr>
+          <w:rFonts w:cs="Arial"/>
+          <w:lang w:val="en-IE"/>
+        </w:rPr>
+        <w:t xml:space="preserve">What would the output be for binary value </w:t>
+      </w:r>
+      <w:r>
+        <w:rPr>
+          <w:rFonts w:cs="Arial"/>
+          <w:lang w:val="en-IE"/>
+        </w:rPr>
+        <w:t xml:space="preserve">of </w:t>
+      </w:r>
+      <w:r>
+        <w:rPr>
+          <w:rFonts w:cs="Arial"/>
+          <w:lang w:val="en-IE"/>
+        </w:rPr>
+        <w:t>1,1,1,1</w:t>
+      </w:r>
+    </w:p>
+    <w:p>
+      <w:pPr>
+        <w:rPr>
+          <w:rFonts w:cs="Arial"/>
+          <w:lang w:val="en-IE"/>
+        </w:rPr>
+      </w:pPr>
+    </w:p>
+    <w:p>
+      <w:pPr>
+        <w:rPr>
+          <w:rFonts w:cs="Arial"/>
+          <w:lang w:val="en-IE"/>
+        </w:rPr>
+      </w:pPr>
+    </w:p>
+    <w:p>
+      <w:pPr>
+        <w:rPr>
+          <w:rFonts w:cs="Arial"/>
+          <w:lang w:val="en-IE"/>
+        </w:rPr>
+      </w:pPr>
+    </w:p>
+    <w:p>
+      <w:pPr>
+        <w:rPr>
+          <w:rFonts w:cs="Arial"/>
+        </w:rPr>
+      </w:pPr>
+    </w:p>
+    <w:p>
+      <w:pPr>
+        <w:rPr>
+          <w:rFonts w:cs="Arial"/>
           <w:b/>
           <w:bCs/>
           <w:lang w:val="en-IE"/>
         </w:rPr>
-        <w:t>0100</w:t>
-      </w:r>
-    </w:p>
-    <w:p>
-      <w:pPr>
-        <w:rPr>
-          <w:lang w:val="en-IE"/>
-        </w:rPr>
-      </w:pPr>
-      <w:r>
-        <w:rPr>
+      </w:pPr>
+      <w:r>
+        <w:rPr>
+          <w:rFonts w:cs="Arial"/>
           <w:b/>
           <w:bCs/>
           <w:lang w:val="en-IE"/>
         </w:rPr>
-        <w:t>2V</w:t>
-      </w:r>
-      <w:r>
-        <w:rPr>
-          <w:lang w:val="en-IE"/>
-        </w:rPr>
-        <w:t xml:space="preserve"> </w:t>
-      </w:r>
-      <w:proofErr w:type="spellStart"/>
-      <w:r>
-        <w:rPr>
-          <w:lang w:val="en-IE"/>
-        </w:rPr>
-        <w:t>en</w:t>
-      </w:r>
-      <w:proofErr w:type="spellEnd"/>
-      <w:r>
-        <w:rPr>
-          <w:lang w:val="en-IE"/>
-        </w:rPr>
-        <w:t xml:space="preserve"> P1.4 → Salida </w:t>
-      </w:r>
-      <w:r>
-        <w:rPr>
+        <w:t>Procedure</w:t>
+      </w:r>
+      <w:r>
+        <w:rPr>
+          <w:rFonts w:cs="Arial"/>
           <w:b/>
           <w:bCs/>
           <w:lang w:val="en-IE"/>
         </w:rPr>
-        <w:t>1001</w:t>
-      </w:r>
-    </w:p>
-    <w:p>
-      <w:pPr>
-        <w:rPr>
+        <w:t xml:space="preserve"> &amp; Results</w:t>
+      </w:r>
+      <w:r>
+        <w:rPr>
+          <w:rFonts w:cs="Arial"/>
           <w:b/>
           <w:bCs/>
           <w:lang w:val="en-IE"/>
         </w:rPr>
-      </w:pPr>
-      <w:r>
-        <w:rPr>
+        <w:t>:</w:t>
+      </w:r>
+    </w:p>
+    <w:p>
+      <w:pPr>
+        <w:rPr>
+          <w:rFonts w:cs="Arial"/>
           <w:b/>
           <w:bCs/>
           <w:lang w:val="en-IE"/>
         </w:rPr>
-        <w:t>3V</w:t>
-      </w:r>
-      <w:r>
-        <w:rPr>
-          <w:lang w:val="en-IE"/>
-        </w:rPr>
-        <w:t xml:space="preserve"> en P1.4 → Salida </w:t>
-      </w:r>
-      <w:r>
-        <w:rPr>
-          <w:b/>
-          <w:bCs/>
-          <w:lang w:val="en-IE"/>
-        </w:rPr>
-        <w:t>1110</w:t>
-      </w:r>
-    </w:p>
-    <w:p>
-      <w:pPr>
-        <w:rPr>
-          <w:b/>
-          <w:bCs/>
-          <w:lang w:val="en-IE"/>
-        </w:rPr>
-      </w:pPr>
-    </w:p>
-    <w:p>
-      <w:pPr>
-        <w:rPr>
-          <w:lang w:val="en-IE"/>
-        </w:rPr>
-      </w:pPr>
-      <w:r>
-        <w:rPr>
-          <w:b/>
-          <w:bCs/>
-          <w:lang w:val="en-IE"/>
-        </w:rPr>
-        <w:t xml:space="preserve">PARTE 3 NO HACE FALTA DIBUJO. Solo </w:t>
-      </w:r>
-      <w:proofErr w:type="spellStart"/>
-      <w:r>
-        <w:rPr>
-          <w:b/>
-          <w:bCs/>
-          <w:lang w:val="en-IE"/>
-        </w:rPr>
-        <w:t>explicar</w:t>
-      </w:r>
-      <w:proofErr w:type="spellEnd"/>
-      <w:r>
-        <w:rPr>
-          <w:b/>
-          <w:bCs/>
-          <w:lang w:val="en-IE"/>
-        </w:rPr>
-        <w:t xml:space="preserve"> </w:t>
-      </w:r>
-      <w:r>
-        <w:rPr>
-          <w:b/>
-          <w:bCs/>
-          <w:lang w:val="en-IE"/>
-        </w:rPr>
-        <w:t xml:space="preserve">lo </w:t>
-      </w:r>
-      <w:proofErr w:type="spellStart"/>
-      <w:r>
-        <w:rPr>
-          <w:b/>
-          <w:bCs/>
-          <w:lang w:val="en-IE"/>
-        </w:rPr>
-        <w:t>que</w:t>
-      </w:r>
-      <w:proofErr w:type="spellEnd"/>
-      <w:r>
-        <w:rPr>
-          <w:b/>
-          <w:bCs/>
-          <w:lang w:val="en-IE"/>
-        </w:rPr>
-        <w:t xml:space="preserve"> </w:t>
-      </w:r>
-      <w:proofErr w:type="spellStart"/>
-      <w:r>
-        <w:rPr>
-          <w:b/>
-          <w:bCs/>
-          <w:lang w:val="en-IE"/>
-        </w:rPr>
-        <w:t>pasa</w:t>
-      </w:r>
-      <w:proofErr w:type="spellEnd"/>
-      <w:r>
-        <w:rPr>
-          <w:b/>
-          <w:bCs/>
-          <w:lang w:val="en-IE"/>
-        </w:rPr>
-        <w:t xml:space="preserve"> y </w:t>
-      </w:r>
-      <w:proofErr w:type="spellStart"/>
-      <w:r>
-        <w:rPr>
-          <w:b/>
-          <w:bCs/>
-          <w:lang w:val="en-IE"/>
-        </w:rPr>
-        <w:t>que</w:t>
-      </w:r>
-      <w:proofErr w:type="spellEnd"/>
-      <w:r>
-        <w:rPr>
-          <w:b/>
-          <w:bCs/>
-          <w:lang w:val="en-IE"/>
-        </w:rPr>
-        <w:t xml:space="preserve"> </w:t>
-      </w:r>
-      <w:proofErr w:type="spellStart"/>
-      <w:r>
-        <w:rPr>
-          <w:b/>
-          <w:bCs/>
-          <w:lang w:val="en-IE"/>
-        </w:rPr>
-        <w:t>cuando</w:t>
-      </w:r>
-      <w:proofErr w:type="spellEnd"/>
-      <w:r>
-        <w:rPr>
-          <w:b/>
-          <w:bCs/>
-          <w:lang w:val="en-IE"/>
-        </w:rPr>
-        <w:t xml:space="preserve"> </w:t>
-      </w:r>
-      <w:proofErr w:type="spellStart"/>
-      <w:r>
-        <w:rPr>
-          <w:b/>
-          <w:bCs/>
-          <w:lang w:val="en-IE"/>
-        </w:rPr>
-        <w:t>generas</w:t>
-      </w:r>
-      <w:proofErr w:type="spellEnd"/>
-      <w:r>
-        <w:rPr>
-          <w:b/>
-          <w:bCs/>
-          <w:lang w:val="en-IE"/>
-        </w:rPr>
-        <w:t xml:space="preserve"> la </w:t>
-      </w:r>
-      <w:proofErr w:type="spellStart"/>
-      <w:r>
-        <w:rPr>
-          <w:b/>
-          <w:bCs/>
-          <w:lang w:val="en-IE"/>
-        </w:rPr>
-        <w:t>senal</w:t>
-      </w:r>
-      <w:proofErr w:type="spellEnd"/>
-      <w:r>
-        <w:rPr>
-          <w:b/>
-          <w:bCs/>
-          <w:lang w:val="en-IE"/>
-        </w:rPr>
-        <w:t xml:space="preserve"> </w:t>
-      </w:r>
-      <w:proofErr w:type="spellStart"/>
-      <w:r>
-        <w:rPr>
-          <w:b/>
-          <w:bCs/>
-          <w:lang w:val="en-IE"/>
-        </w:rPr>
-        <w:t>en</w:t>
-      </w:r>
-      <w:proofErr w:type="spellEnd"/>
-      <w:r>
-        <w:rPr>
-          <w:b/>
-          <w:bCs/>
-          <w:lang w:val="en-IE"/>
-        </w:rPr>
-        <w:t xml:space="preserve"> MP750510 varia </w:t>
-      </w:r>
-      <w:proofErr w:type="spellStart"/>
-      <w:r>
-        <w:rPr>
-          <w:b/>
-          <w:bCs/>
-          <w:lang w:val="en-IE"/>
-        </w:rPr>
-        <w:t>por</w:t>
-      </w:r>
-      <w:proofErr w:type="spellEnd"/>
-      <w:r>
-        <w:rPr>
-          <w:b/>
-          <w:bCs/>
-          <w:lang w:val="en-IE"/>
-        </w:rPr>
-        <w:t xml:space="preserve"> </w:t>
-      </w:r>
-      <w:proofErr w:type="spellStart"/>
-      <w:r>
-        <w:rPr>
-          <w:b/>
-          <w:bCs/>
-          <w:lang w:val="en-IE"/>
-        </w:rPr>
-        <w:t>que</w:t>
-      </w:r>
-      <w:proofErr w:type="spellEnd"/>
-      <w:r>
-        <w:rPr>
-          <w:b/>
-          <w:bCs/>
-          <w:lang w:val="en-IE"/>
-        </w:rPr>
-        <w:t xml:space="preserve"> no es </w:t>
-      </w:r>
-      <w:proofErr w:type="spellStart"/>
-      <w:r>
-        <w:rPr>
-          <w:b/>
-          <w:bCs/>
-          <w:lang w:val="en-IE"/>
-        </w:rPr>
-        <w:t>constante</w:t>
-      </w:r>
-      <w:proofErr w:type="spellEnd"/>
-      <w:r>
-        <w:rPr>
-          <w:b/>
-          <w:bCs/>
-          <w:lang w:val="en-IE"/>
-        </w:rPr>
-        <w:t xml:space="preserve"> la </w:t>
-      </w:r>
-      <w:proofErr w:type="spellStart"/>
-      <w:r>
-        <w:rPr>
-          <w:b/>
-          <w:bCs/>
-          <w:lang w:val="en-IE"/>
-        </w:rPr>
-        <w:t>senal</w:t>
-      </w:r>
-      <w:proofErr w:type="spellEnd"/>
-      <w:r>
-        <w:rPr>
-          <w:b/>
-          <w:bCs/>
-          <w:lang w:val="en-IE"/>
-        </w:rPr>
-        <w:t xml:space="preserve"> y </w:t>
-      </w:r>
-      <w:proofErr w:type="spellStart"/>
-      <w:r>
-        <w:rPr>
-          <w:b/>
-          <w:bCs/>
-          <w:lang w:val="en-IE"/>
-        </w:rPr>
-        <w:t>que</w:t>
-      </w:r>
-      <w:proofErr w:type="spellEnd"/>
-      <w:r>
-        <w:rPr>
-          <w:b/>
-          <w:bCs/>
-          <w:lang w:val="en-IE"/>
-        </w:rPr>
-        <w:t xml:space="preserve"> </w:t>
-      </w:r>
-      <w:proofErr w:type="spellStart"/>
-      <w:r>
-        <w:rPr>
-          <w:b/>
-          <w:bCs/>
-          <w:lang w:val="en-IE"/>
-        </w:rPr>
-        <w:t>haciendolo</w:t>
-      </w:r>
-      <w:proofErr w:type="spellEnd"/>
-      <w:r>
-        <w:rPr>
-          <w:b/>
-          <w:bCs/>
-          <w:lang w:val="en-IE"/>
-        </w:rPr>
-        <w:t xml:space="preserve"> </w:t>
-      </w:r>
-      <w:proofErr w:type="spellStart"/>
-      <w:r>
-        <w:rPr>
-          <w:b/>
-          <w:bCs/>
-          <w:lang w:val="en-IE"/>
-        </w:rPr>
-        <w:t>en</w:t>
-      </w:r>
-      <w:proofErr w:type="spellEnd"/>
-      <w:r>
-        <w:rPr>
-          <w:b/>
-          <w:bCs/>
-          <w:lang w:val="en-IE"/>
-        </w:rPr>
-        <w:t xml:space="preserve"> el EL302Tv </w:t>
-      </w:r>
-      <w:proofErr w:type="spellStart"/>
-      <w:r>
-        <w:rPr>
-          <w:b/>
-          <w:bCs/>
-          <w:lang w:val="en-IE"/>
-        </w:rPr>
-        <w:t>si</w:t>
-      </w:r>
-      <w:proofErr w:type="spellEnd"/>
-      <w:r>
-        <w:rPr>
-          <w:b/>
-          <w:bCs/>
-          <w:lang w:val="en-IE"/>
-        </w:rPr>
-        <w:t xml:space="preserve"> </w:t>
-      </w:r>
-      <w:proofErr w:type="spellStart"/>
-      <w:r>
-        <w:rPr>
-          <w:b/>
-          <w:bCs/>
-          <w:lang w:val="en-IE"/>
-        </w:rPr>
-        <w:t>funciona</w:t>
-      </w:r>
-      <w:proofErr w:type="spellEnd"/>
-      <w:r>
-        <w:rPr>
-          <w:b/>
-          <w:bCs/>
-          <w:lang w:val="en-IE"/>
-        </w:rPr>
-        <w:t xml:space="preserve"> major </w:t>
-      </w:r>
-      <w:proofErr w:type="spellStart"/>
-      <w:r>
-        <w:rPr>
-          <w:b/>
-          <w:bCs/>
-          <w:lang w:val="en-IE"/>
-        </w:rPr>
-        <w:t>porque</w:t>
-      </w:r>
-      <w:proofErr w:type="spellEnd"/>
-      <w:r>
-        <w:rPr>
-          <w:b/>
-          <w:bCs/>
-          <w:lang w:val="en-IE"/>
-        </w:rPr>
-        <w:t xml:space="preserve"> la </w:t>
-      </w:r>
-      <w:proofErr w:type="spellStart"/>
-      <w:r>
-        <w:rPr>
-          <w:b/>
-          <w:bCs/>
-          <w:lang w:val="en-IE"/>
-        </w:rPr>
-        <w:t>senal</w:t>
-      </w:r>
-      <w:proofErr w:type="spellEnd"/>
-      <w:r>
-        <w:rPr>
-          <w:b/>
-          <w:bCs/>
-          <w:lang w:val="en-IE"/>
-        </w:rPr>
-        <w:t xml:space="preserve"> </w:t>
-      </w:r>
-      <w:proofErr w:type="spellStart"/>
-      <w:r>
-        <w:rPr>
-          <w:b/>
-          <w:bCs/>
-          <w:lang w:val="en-IE"/>
-        </w:rPr>
-        <w:t>que</w:t>
-      </w:r>
-      <w:proofErr w:type="spellEnd"/>
-      <w:r>
-        <w:rPr>
-          <w:b/>
-          <w:bCs/>
-          <w:lang w:val="en-IE"/>
-        </w:rPr>
-        <w:t xml:space="preserve"> genera es </w:t>
-      </w:r>
-      <w:proofErr w:type="spellStart"/>
-      <w:r>
-        <w:rPr>
-          <w:b/>
-          <w:bCs/>
-          <w:lang w:val="en-IE"/>
-        </w:rPr>
-        <w:t>constante</w:t>
-      </w:r>
-      <w:proofErr w:type="spellEnd"/>
-      <w:r>
-        <w:rPr>
-          <w:b/>
-          <w:bCs/>
-          <w:lang w:val="en-IE"/>
-        </w:rPr>
-        <w:t>.</w:t>
-      </w:r>
-    </w:p>
-    <w:p>
-      <w:pPr>
-        <w:rPr>
-          <w:lang w:val="en-IE"/>
-        </w:rPr>
-      </w:pPr>
-    </w:p>
-    <w:p>
-      <w:pPr>
-        <w:rPr>
-          <w:lang w:val="en-IE"/>
-        </w:rPr>
-      </w:pPr>
-    </w:p>
-    <w:p>
-      <w:pPr>
-        <w:rPr>
-          <w:lang w:val="en-IE"/>
-        </w:rPr>
-      </w:pPr>
-      <w:r>
-        <w:rPr>
-          <w:lang w:val="en-IE"/>
-        </w:rPr>
-        <w:t xml:space="preserve">PARTE 4. DIBUJAR COMO SE VERIA CON LOS 16 NIVELES. Y EXPLICAR QUE LA RAZON PRINICIPAL POR LA QUE NO FUNCIONA ES POR UN MAL CABLEADO DENTRO DE </w:t>
-      </w:r>
-      <w:r>
-        <w:rPr>
-          <w:lang w:val="en-IE"/>
-        </w:rPr>
-        <w:t>LA BREADBOARD</w:t>
-      </w:r>
-    </w:p>
-    <w:p>
-      <w:pPr>
-        <w:rPr>
-          <w:lang w:val="en-IE"/>
-        </w:rPr>
-      </w:pPr>
-    </w:p>
-    <w:p>
-      <w:pPr>
-        <w:pStyle w:val="Heading1"/>
-        <w:rPr>
-          <w:lang w:val="en-IE"/>
-        </w:rPr>
-      </w:pPr>
-      <w:r>
-        <w:rPr>
-          <w:lang w:val="en-IE"/>
-        </w:rPr>
-        <w:t xml:space="preserve">5. </w:t>
-      </w:r>
-      <w:r>
-        <w:rPr>
-          <w:lang w:val="en-IE"/>
-        </w:rPr>
-        <w:t>Analysis and Questions</w:t>
-      </w:r>
-    </w:p>
-    <w:p>
-      <w:pPr>
-        <w:rPr>
-          <w:rFonts w:cs="Arial"/>
-          <w:lang w:val="en-IE"/>
-        </w:rPr>
-      </w:pPr>
-    </w:p>
-    <w:p>
-      <w:pPr>
-        <w:rPr>
-          <w:rFonts w:cs="Arial"/>
-          <w:lang w:val="en-IE"/>
-        </w:rPr>
-      </w:pPr>
-      <w:r>
-        <w:rPr>
-          <w:rFonts w:cs="Arial"/>
-          <w:b/>
-          <w:bCs/>
-          <w:lang w:val="en-IE"/>
-        </w:rPr>
-        <w:t>Question</w:t>
-      </w:r>
-      <w:r>
-        <w:rPr>
-          <w:rFonts w:cs="Arial"/>
-          <w:b/>
-          <w:bCs/>
-          <w:lang w:val="en-IE"/>
-        </w:rPr>
-        <w:t xml:space="preserve"> 1</w:t>
-      </w:r>
-      <w:r>
-        <w:rPr>
-          <w:rFonts w:cs="Arial"/>
-          <w:b/>
-          <w:bCs/>
-          <w:lang w:val="en-IE"/>
-        </w:rPr>
-        <w:t xml:space="preserve">: </w:t>
-      </w:r>
-      <w:r>
-        <w:rPr>
-          <w:rFonts w:cs="Arial"/>
-          <w:lang w:val="en-IE"/>
-        </w:rPr>
-        <w:t xml:space="preserve">What would the output be for binary value </w:t>
-      </w:r>
-      <w:r>
-        <w:rPr>
-          <w:rFonts w:cs="Arial"/>
-          <w:lang w:val="en-IE"/>
-        </w:rPr>
-        <w:t xml:space="preserve">of </w:t>
-      </w:r>
-      <w:r>
-        <w:rPr>
-          <w:rFonts w:cs="Arial"/>
-          <w:lang w:val="en-IE"/>
-        </w:rPr>
-        <w:t>1,1,1,1</w:t>
-      </w:r>
-    </w:p>
-    <w:p>
-      <w:pPr>
-        <w:rPr>
-          <w:rFonts w:cs="Arial"/>
-          <w:lang w:val="en-IE"/>
-        </w:rPr>
-      </w:pPr>
-    </w:p>
-    <w:p>
-      <w:pPr>
-        <w:rPr>
-          <w:rFonts w:cs="Arial"/>
-          <w:lang w:val="en-IE"/>
-        </w:rPr>
-      </w:pPr>
-    </w:p>
-    <w:p>
-      <w:pPr>
-        <w:rPr>
-          <w:rFonts w:cs="Arial"/>
-          <w:lang w:val="en-IE"/>
-        </w:rPr>
-      </w:pPr>
-    </w:p>
-    <w:p>
-      <w:pPr>
-        <w:rPr>
-          <w:rFonts w:cs="Arial"/>
-        </w:rPr>
-      </w:pPr>
-    </w:p>
-    <w:p>
-      <w:pPr>
-        <w:rPr>
-          <w:rFonts w:cs="Arial"/>
-          <w:b/>
-          <w:bCs/>
-          <w:lang w:val="en-IE"/>
-        </w:rPr>
-      </w:pPr>
-      <w:r>
-        <w:rPr>
-          <w:rFonts w:cs="Arial"/>
-          <w:b/>
-          <w:bCs/>
-          <w:lang w:val="en-IE"/>
-        </w:rPr>
-        <w:t>Procedure</w:t>
-      </w:r>
-      <w:r>
-        <w:rPr>
-          <w:rFonts w:cs="Arial"/>
-          <w:b/>
-          <w:bCs/>
-          <w:lang w:val="en-IE"/>
-        </w:rPr>
-        <w:t xml:space="preserve"> &amp; Results</w:t>
-      </w:r>
-      <w:r>
-        <w:rPr>
-          <w:rFonts w:cs="Arial"/>
-          <w:b/>
-          <w:bCs/>
-          <w:lang w:val="en-IE"/>
-        </w:rPr>
-        <w:t>:</w:t>
-      </w:r>
-    </w:p>
-    <w:p>
-      <w:pPr>
-        <w:rPr>
-          <w:rFonts w:cs="Arial"/>
-          <w:b/>
-          <w:bCs/>
-          <w:lang w:val="en-IE"/>
-        </w:rPr>
-      </w:pPr>
-    </w:p>
-    <w:p>
-      <w:pPr>
-        <w:pStyle w:val="ListParagraph"/>
+      </w:pPr>
+    </w:p>
+    <w:p>
+      <w:pPr>
+        <w:pStyle w:val="Prrafodelista"/>
         <w:numPr>
           <w:ilvl w:val="0"/>
           <w:numId w:val="3"/>
@@ -3815,9 +2370,8 @@
           <w:sz w:val="24"/>
           <w:szCs w:val="24"/>
         </w:rPr>
-        <w:t xml:space="preserve">) to pin P1.4. Measure pins P1.0 through P1.3 with a </w:t>
-      </w:r>
-      <w:proofErr w:type="spellStart"/>
+        <w:t>) to pin P1.4. Measure pins P1.0 through P1.3 with a multimeter or digital oscilloscope to verify that the binary outputs track perfectly with your expected values</w:t>
+      </w:r>
       <w:r>
         <w:rPr>
           <w:rFonts w:ascii="Arial" w:hAnsi="Arial" w:cs="Arial"/>
@@ -3825,25 +2379,6 @@
           <w:sz w:val="24"/>
           <w:szCs w:val="24"/>
         </w:rPr>
-        <w:t>multimeter</w:t>
-      </w:r>
-      <w:proofErr w:type="spellEnd"/>
-      <w:r>
-        <w:rPr>
-          <w:rFonts w:ascii="Arial" w:hAnsi="Arial" w:cs="Arial"/>
-          <w:bCs/>
-          <w:sz w:val="24"/>
-          <w:szCs w:val="24"/>
-        </w:rPr>
-        <w:t xml:space="preserve"> or digital oscilloscope to verify that the binary outputs track perfectly with your expected values</w:t>
-      </w:r>
-      <w:r>
-        <w:rPr>
-          <w:rFonts w:ascii="Arial" w:hAnsi="Arial" w:cs="Arial"/>
-          <w:bCs/>
-          <w:sz w:val="24"/>
-          <w:szCs w:val="24"/>
-        </w:rPr>
         <w:t>.</w:t>
       </w:r>
     </w:p>
@@ -4039,7 +2574,6 @@
           <w:rFonts w:cs="Arial"/>
           <w:noProof/>
         </w:rPr>
-        <w:lastRenderedPageBreak/>
         <w:drawing>
           <wp:inline distT="0" distB="0" distL="0" distR="0" wp14:anchorId="6B17F15D" wp14:editId="10937B1E">
             <wp:extent cx="4282192" cy="2099144"/>
@@ -4054,7 +2588,7 @@
             <wp:cNvGraphicFramePr/>
             <a:graphic xmlns:a="http://schemas.openxmlformats.org/drawingml/2006/main">
               <a:graphicData uri="http://schemas.openxmlformats.org/drawingml/2006/chart">
-                <c:chart xmlns:c="http://schemas.openxmlformats.org/drawingml/2006/chart" xmlns:r="http://schemas.openxmlformats.org/officeDocument/2006/relationships" r:id="rId10"/>
+                <c:chart xmlns:c="http://schemas.openxmlformats.org/drawingml/2006/chart" xmlns:r="http://schemas.openxmlformats.org/officeDocument/2006/relationships" r:id="rId16"/>
               </a:graphicData>
             </a:graphic>
           </wp:inline>
@@ -4456,7 +2990,6 @@
         <w:rPr>
           <w:rFonts w:cs="Arial"/>
         </w:rPr>
-        <w:lastRenderedPageBreak/>
         <w:t>Procedure:</w:t>
       </w:r>
       <w:r>
@@ -4485,21 +3018,7 @@
           <w:rFonts w:cs="Arial"/>
         </w:rPr>
         <w:tab/>
-        <w:t xml:space="preserve">Data, tables or computer printout, graphs </w:t>
-      </w:r>
-      <w:proofErr w:type="spellStart"/>
-      <w:r>
-        <w:rPr>
-          <w:rFonts w:cs="Arial"/>
-        </w:rPr>
-        <w:t>etc</w:t>
-      </w:r>
-      <w:proofErr w:type="spellEnd"/>
-      <w:r>
-        <w:rPr>
-          <w:rFonts w:cs="Arial"/>
-        </w:rPr>
-        <w:t xml:space="preserve">, show all calculations, final outcomes, percentage errors etc. </w:t>
+        <w:t xml:space="preserve">Data, tables or computer printout, graphs etc, show all calculations, final outcomes, percentage errors etc. </w:t>
       </w:r>
     </w:p>
     <w:p>
@@ -4589,14 +3108,14 @@
     </w:p>
     <w:p>
       <w:pPr>
-        <w:pStyle w:val="Heading1"/>
+        <w:pStyle w:val="Ttulo1"/>
         <w:spacing w:before="0" w:after="0"/>
         <w:jc w:val="center"/>
         <w:rPr>
           <w:rFonts w:ascii="Trebuchet MS" w:hAnsi="Trebuchet MS"/>
         </w:rPr>
         <w:sectPr>
-          <w:footerReference w:type="default" r:id="rId11"/>
+          <w:footerReference w:type="default" r:id="rId17"/>
           <w:pgSz w:w="12240" w:h="15840"/>
           <w:pgMar w:top="1440" w:right="1800" w:bottom="1440" w:left="1800" w:header="708" w:footer="708" w:gutter="0"/>
           <w:cols w:space="708"/>
@@ -4612,7 +3131,7 @@
     </w:p>
     <w:p>
       <w:pPr>
-        <w:pStyle w:val="Heading1"/>
+        <w:pStyle w:val="Ttulo1"/>
         <w:spacing w:before="0" w:after="0"/>
         <w:jc w:val="center"/>
         <w:rPr>
@@ -4686,7 +3205,7 @@
           </w:tcPr>
           <w:p>
             <w:pPr>
-              <w:pStyle w:val="Header"/>
+              <w:pStyle w:val="Encabezado"/>
               <w:spacing w:before="120"/>
               <w:jc w:val="center"/>
               <w:rPr>
@@ -4832,7 +3351,7 @@
           </w:tcPr>
           <w:p>
             <w:pPr>
-              <w:pStyle w:val="Header"/>
+              <w:pStyle w:val="Encabezado"/>
               <w:jc w:val="center"/>
               <w:rPr>
                 <w:rFonts w:cs="Arial"/>
@@ -4843,7 +3362,7 @@
           </w:p>
           <w:p>
             <w:pPr>
-              <w:pStyle w:val="Header"/>
+              <w:pStyle w:val="Encabezado"/>
               <w:jc w:val="center"/>
               <w:rPr>
                 <w:rFonts w:cs="Arial"/>
@@ -4866,7 +3385,7 @@
           </w:p>
           <w:p>
             <w:pPr>
-              <w:pStyle w:val="Header"/>
+              <w:pStyle w:val="Encabezado"/>
               <w:rPr>
                 <w:rFonts w:cs="Arial"/>
                 <w:b/>
@@ -4888,7 +3407,7 @@
           </w:p>
           <w:p>
             <w:pPr>
-              <w:pStyle w:val="Header"/>
+              <w:pStyle w:val="Encabezado"/>
               <w:jc w:val="center"/>
               <w:rPr>
                 <w:rFonts w:cs="Arial"/>
@@ -5672,7 +4191,7 @@
 <w:ftr xmlns:wpc="http://schemas.microsoft.com/office/word/2010/wordprocessingCanvas" xmlns:cx="http://schemas.microsoft.com/office/drawing/2014/chartex" xmlns:cx1="http://schemas.microsoft.com/office/drawing/2015/9/8/chartex" xmlns:cx2="http://schemas.microsoft.com/office/drawing/2015/10/21/chartex" xmlns:cx3="http://schemas.microsoft.com/office/drawing/2016/5/9/chartex" xmlns:cx4="http://schemas.microsoft.com/office/drawing/2016/5/10/chartex" xmlns:cx5="http://schemas.microsoft.com/office/drawing/2016/5/11/chartex" xmlns:cx6="http://schemas.microsoft.com/office/drawing/2016/5/12/chartex" xmlns:cx7="http://schemas.microsoft.com/office/drawing/2016/5/13/chartex" xmlns:cx8="http://schemas.microsoft.com/office/drawing/2016/5/14/chartex" xmlns:mc="http://schemas.openxmlformats.org/markup-compatibility/2006" xmlns:aink="http://schemas.microsoft.com/office/drawing/2016/ink" xmlns:am3d="http://schemas.microsoft.com/office/drawing/2017/model3d" xmlns:o="urn:schemas-microsoft-com:office:office" xmlns:oel="http://schemas.microsoft.com/office/2019/extlst" xmlns:r="http://schemas.openxmlformats.org/officeDocument/2006/relationships" xmlns:m="http://schemas.openxmlformats.org/officeDocument/2006/math" xmlns:v="urn:schemas-microsoft-com:vml" xmlns:wp14="http://schemas.microsoft.com/office/word/2010/wordprocessingDrawing" xmlns:wp="http://schemas.openxmlformats.org/drawingml/2006/wordprocessingDrawing" xmlns:w10="urn:schemas-microsoft-com:office:word" xmlns:w="http://schemas.openxmlformats.org/wordprocessingml/2006/main" xmlns:w14="http://schemas.microsoft.com/office/word/2010/wordml" xmlns:w15="http://schemas.microsoft.com/office/word/2012/wordml" xmlns:w16cex="http://schemas.microsoft.com/office/word/2018/wordml/cex" xmlns:w16cid="http://schemas.microsoft.com/office/word/2016/wordml/cid" xmlns:w16="http://schemas.microsoft.com/office/word/2018/wordml" xmlns:w16du="http://schemas.microsoft.com/office/word/2023/wordml/word16du" xmlns:w16sdtdh="http://schemas.microsoft.com/office/word/2020/wordml/sdtdatahash" xmlns:w16sdtfl="http://schemas.microsoft.com/office/word/2024/wordml/sdtformatlock" xmlns:w16se="http://schemas.microsoft.com/office/word/2015/wordml/symex" xmlns:wpg="http://schemas.microsoft.com/office/word/2010/wordprocessingGroup" xmlns:wpi="http://schemas.microsoft.com/office/word/2010/wordprocessingInk" xmlns:wne="http://schemas.microsoft.com/office/word/2006/wordml" xmlns:wps="http://schemas.microsoft.com/office/word/2010/wordprocessingShape" mc:Ignorable="w14 w15 w16se w16cid w16 w16cex w16sdtdh w16sdtfl w16du wp14">
   <w:p>
     <w:pPr>
-      <w:pStyle w:val="Footer"/>
+      <w:pStyle w:val="Piedepgina"/>
       <w:rPr>
         <w:rFonts w:cs="Arial"/>
         <w:sz w:val="32"/>
@@ -6740,11 +5259,11 @@
       <w:lang w:eastAsia="en-US"/>
     </w:rPr>
   </w:style>
-  <w:style w:type="paragraph" w:styleId="Heading1">
+  <w:style w:type="paragraph" w:styleId="Ttulo1">
     <w:name w:val="heading 1"/>
     <w:basedOn w:val="Normal"/>
     <w:next w:val="Normal"/>
-    <w:link w:val="Heading1Char"/>
+    <w:link w:val="Ttulo1Car"/>
     <w:qFormat/>
     <w:rsid w:val="00D811DB"/>
     <w:pPr>
@@ -6761,12 +5280,12 @@
       <w:szCs w:val="32"/>
     </w:rPr>
   </w:style>
-  <w:style w:type="character" w:default="1" w:styleId="DefaultParagraphFont">
+  <w:style w:type="character" w:default="1" w:styleId="Fuentedeprrafopredeter">
     <w:name w:val="Default Paragraph Font"/>
     <w:uiPriority w:val="1"/>
     <w:unhideWhenUsed/>
   </w:style>
-  <w:style w:type="table" w:default="1" w:styleId="TableNormal">
+  <w:style w:type="table" w:default="1" w:styleId="Tablanormal">
     <w:name w:val="Normal Table"/>
     <w:uiPriority w:val="99"/>
     <w:semiHidden/>
@@ -6781,16 +5300,16 @@
       </w:tblCellMar>
     </w:tblPr>
   </w:style>
-  <w:style w:type="numbering" w:default="1" w:styleId="NoList">
+  <w:style w:type="numbering" w:default="1" w:styleId="Sinlista">
     <w:name w:val="No List"/>
     <w:uiPriority w:val="99"/>
     <w:semiHidden/>
     <w:unhideWhenUsed/>
   </w:style>
-  <w:style w:type="paragraph" w:styleId="Header">
+  <w:style w:type="paragraph" w:styleId="Encabezado">
     <w:name w:val="header"/>
     <w:basedOn w:val="Normal"/>
-    <w:link w:val="HeaderChar"/>
+    <w:link w:val="EncabezadoCar"/>
     <w:rsid w:val="00305092"/>
     <w:pPr>
       <w:tabs>
@@ -6799,9 +5318,9 @@
       </w:tabs>
     </w:pPr>
   </w:style>
-  <w:style w:type="character" w:customStyle="1" w:styleId="HeaderChar">
-    <w:name w:val="Header Char"/>
-    <w:link w:val="Header"/>
+  <w:style w:type="character" w:customStyle="1" w:styleId="EncabezadoCar">
+    <w:name w:val="Encabezado Car"/>
+    <w:link w:val="Encabezado"/>
     <w:rsid w:val="00305092"/>
     <w:rPr>
       <w:rFonts w:ascii="Arial" w:hAnsi="Arial"/>
@@ -6810,10 +5329,10 @@
       <w:lang w:val="en-US" w:eastAsia="en-US"/>
     </w:rPr>
   </w:style>
-  <w:style w:type="paragraph" w:styleId="Footer">
+  <w:style w:type="paragraph" w:styleId="Piedepgina">
     <w:name w:val="footer"/>
     <w:basedOn w:val="Normal"/>
-    <w:link w:val="FooterChar"/>
+    <w:link w:val="PiedepginaCar"/>
     <w:uiPriority w:val="99"/>
     <w:rsid w:val="00305092"/>
     <w:pPr>
@@ -6823,9 +5342,9 @@
       </w:tabs>
     </w:pPr>
   </w:style>
-  <w:style w:type="character" w:customStyle="1" w:styleId="FooterChar">
-    <w:name w:val="Footer Char"/>
-    <w:link w:val="Footer"/>
+  <w:style w:type="character" w:customStyle="1" w:styleId="PiedepginaCar">
+    <w:name w:val="Pie de página Car"/>
+    <w:link w:val="Piedepgina"/>
     <w:uiPriority w:val="99"/>
     <w:rsid w:val="00305092"/>
     <w:rPr>
@@ -6835,10 +5354,10 @@
       <w:lang w:val="en-US" w:eastAsia="en-US"/>
     </w:rPr>
   </w:style>
-  <w:style w:type="character" w:customStyle="1" w:styleId="Heading1Char">
-    <w:name w:val="Heading 1 Char"/>
-    <w:basedOn w:val="DefaultParagraphFont"/>
-    <w:link w:val="Heading1"/>
+  <w:style w:type="character" w:customStyle="1" w:styleId="Ttulo1Car">
+    <w:name w:val="Título 1 Car"/>
+    <w:basedOn w:val="Fuentedeprrafopredeter"/>
+    <w:link w:val="Ttulo1"/>
     <w:rsid w:val="00D811DB"/>
     <w:rPr>
       <w:rFonts w:ascii="Arial" w:hAnsi="Arial" w:cs="Arial"/>
@@ -6850,7 +5369,7 @@
       <w:lang w:eastAsia="en-US"/>
     </w:rPr>
   </w:style>
-  <w:style w:type="paragraph" w:styleId="ListParagraph">
+  <w:style w:type="paragraph" w:styleId="Prrafodelista">
     <w:name w:val="List Paragraph"/>
     <w:basedOn w:val="Normal"/>
     <w:uiPriority w:val="34"/>
@@ -6867,7 +5386,7 @@
       <w:lang w:val="en-GB"/>
     </w:rPr>
   </w:style>
-  <w:style w:type="paragraph" w:styleId="Caption">
+  <w:style w:type="paragraph" w:styleId="Descripcin">
     <w:name w:val="caption"/>
     <w:basedOn w:val="Normal"/>
     <w:next w:val="Normal"/>
@@ -6891,7 +5410,7 @@
 <file path=word/charts/chart1.xml><?xml version="1.0" encoding="utf-8"?>
 <c:chartSpace xmlns:c="http://schemas.openxmlformats.org/drawingml/2006/chart" xmlns:a="http://schemas.openxmlformats.org/drawingml/2006/main" xmlns:r="http://schemas.openxmlformats.org/officeDocument/2006/relationships" xmlns:c16r2="http://schemas.microsoft.com/office/drawing/2015/06/chart">
   <c:date1904 val="0"/>
-  <c:lang val="en-US"/>
+  <c:lang val="es-ES"/>
   <c:roundedCorners val="0"/>
   <mc:AlternateContent xmlns:mc="http://schemas.openxmlformats.org/markup-compatibility/2006">
     <mc:Choice xmlns:c14="http://schemas.microsoft.com/office/drawing/2007/8/2/chart" Requires="c14">
@@ -9404,6 +7923,18 @@
 </a:theme>
 </file>
 
+<file path=customXml/item1.xml><?xml version="1.0" encoding="utf-8"?>
+<b:Sources xmlns:b="http://schemas.openxmlformats.org/officeDocument/2006/bibliography" xmlns="http://schemas.openxmlformats.org/officeDocument/2006/bibliography" SelectedStyle="\APASixthEditionOfficeOnline.xsl" StyleName="APA" Version="6"/>
+</file>
+
+<file path=customXml/itemProps1.xml><?xml version="1.0" encoding="utf-8"?>
+<ds:datastoreItem xmlns:ds="http://schemas.openxmlformats.org/officeDocument/2006/customXml" ds:itemID="{81031BB2-E088-46A1-AF30-6D8567DB5915}">
+  <ds:schemaRefs>
+    <ds:schemaRef ds:uri="http://schemas.openxmlformats.org/officeDocument/2006/bibliography"/>
+  </ds:schemaRefs>
+</ds:datastoreItem>
+</file>
+
 <file path=docMetadata/LabelInfo.xml><?xml version="1.0" encoding="utf-8"?>
 <clbl:labelList xmlns:clbl="http://schemas.microsoft.com/office/2020/mipLabelMetadata">
   <clbl:label id="{47855545-00bb-4800-a65f-e79104ec0fc4}" enabled="0" method="" siteId="{47855545-00bb-4800-a65f-e79104ec0fc4}" removed="1"/>

</xml_diff>

<commit_message>
Part 4 finished. Still left translate to English and Questions
</commit_message>
<xml_diff>
--- a/Assignment 3/Lab_report_3.docx
+++ b/Assignment 3/Lab_report_3.docx
@@ -1114,8 +1114,112 @@
         <w:rPr>
           <w:lang w:val="en-IE"/>
         </w:rPr>
-        <w:lastRenderedPageBreak/>
         <w:t>Analogue Input Generation</w:t>
+      </w:r>
+    </w:p>
+    <w:p>
+      <w:pPr>
+        <w:rPr>
+          <w:lang w:val="es-ES"/>
+        </w:rPr>
+      </w:pPr>
+      <w:r>
+        <w:rPr>
+          <w:lang w:val="es-ES"/>
+        </w:rPr>
+        <w:t xml:space="preserve">Durante </w:t>
+      </w:r>
+      <w:r>
+        <w:rPr>
+          <w:lang w:val="es-ES"/>
+        </w:rPr>
+        <w:t xml:space="preserve">esta primera parte </w:t>
+      </w:r>
+      <w:r>
+        <w:rPr>
+          <w:lang w:val="es-ES"/>
+        </w:rPr>
+        <w:t>s</w:t>
+      </w:r>
+      <w:r>
+        <w:rPr>
+          <w:lang w:val="es-ES"/>
+        </w:rPr>
+        <w:t>e configuró una señal senoidal</w:t>
+      </w:r>
+      <w:r>
+        <w:rPr>
+          <w:lang w:val="es-ES"/>
+        </w:rPr>
+        <w:t xml:space="preserve"> en el generador de señales MP750510.</w:t>
+      </w:r>
+    </w:p>
+    <w:p>
+      <w:pPr>
+        <w:rPr>
+          <w:lang w:val="es-ES"/>
+        </w:rPr>
+      </w:pPr>
+      <w:r>
+        <w:rPr>
+          <w:lang w:val="es-ES"/>
+        </w:rPr>
+        <w:t xml:space="preserve">Esta se </w:t>
+      </w:r>
+      <w:r>
+        <w:rPr>
+          <w:lang w:val="es-ES"/>
+        </w:rPr>
+        <w:t>ajustó</w:t>
+      </w:r>
+      <w:r>
+        <w:rPr>
+          <w:lang w:val="es-ES"/>
+        </w:rPr>
+        <w:t xml:space="preserve"> con una frecuencia de 2 Hz</w:t>
+      </w:r>
+      <w:r>
+        <w:rPr>
+          <w:lang w:val="es-ES"/>
+        </w:rPr>
+        <w:t xml:space="preserve"> y</w:t>
+      </w:r>
+      <w:r>
+        <w:rPr>
+          <w:lang w:val="es-ES"/>
+        </w:rPr>
+        <w:t xml:space="preserve"> </w:t>
+      </w:r>
+      <w:r>
+        <w:rPr>
+          <w:lang w:val="es-ES"/>
+        </w:rPr>
+        <w:t xml:space="preserve">el offset y la amplitud </w:t>
+      </w:r>
+      <w:r>
+        <w:rPr>
+          <w:lang w:val="es-ES"/>
+        </w:rPr>
+        <w:t>spans a strict range of 0V to 3V</w:t>
+      </w:r>
+      <w:r>
+        <w:rPr>
+          <w:lang w:val="es-ES"/>
+        </w:rPr>
+        <w:t xml:space="preserve">. </w:t>
+      </w:r>
+    </w:p>
+    <w:p>
+      <w:pPr>
+        <w:rPr>
+          <w:lang w:val="es-ES"/>
+        </w:rPr>
+      </w:pPr>
+      <w:r>
+        <w:rPr>
+          <w:lang w:val="es-ES"/>
+        </w:rPr>
+        <w:t>Se puede apreciar la conifuguración en la figura 1 y el test de la onda en el osciloscopio en la figura 2.</w:t>
       </w:r>
     </w:p>
     <w:p>
@@ -1125,7 +1229,7 @@
         <w:jc w:val="center"/>
         <w:rPr>
           <w:noProof/>
-          <w:lang w:val="en-IE"/>
+          <w:lang w:val="es-ES"/>
         </w:rPr>
       </w:pPr>
     </w:p>
@@ -1141,7 +1245,7 @@
           <w:lang w:val="en-IE"/>
         </w:rPr>
         <w:drawing>
-          <wp:inline distT="0" distB="0" distL="0" distR="0" wp14:anchorId="1E60D5D9" wp14:editId="5D9BC403">
+          <wp:inline distT="0" distB="0" distL="0" distR="0" wp14:anchorId="1E60D5D9" wp14:editId="3BCAE283">
             <wp:extent cx="4653608" cy="3569368"/>
             <wp:effectExtent l="0" t="0" r="0" b="0"/>
             <wp:docPr id="1664436414" name="Imagen 1"/>
@@ -1200,24 +1304,14 @@
       <w:r>
         <w:t xml:space="preserve">Figure </w:t>
       </w:r>
-      <w:r>
-        <w:fldChar w:fldCharType="begin"/>
-      </w:r>
-      <w:r>
-        <w:instrText xml:space="preserve"> SEQ Figure \* ARABIC </w:instrText>
-      </w:r>
-      <w:r>
-        <w:fldChar w:fldCharType="separate"/>
-      </w:r>
-      <w:r>
-        <w:rPr>
-          <w:noProof/>
-        </w:rPr>
-        <w:t>1</w:t>
-      </w:r>
-      <w:r>
-        <w:fldChar w:fldCharType="end"/>
-      </w:r>
+      <w:fldSimple w:instr=" SEQ Figure \* ARABIC ">
+        <w:r>
+          <w:rPr>
+            <w:noProof/>
+          </w:rPr>
+          <w:t>1</w:t>
+        </w:r>
+      </w:fldSimple>
       <w:r>
         <w:t>: Configured wave</w:t>
       </w:r>
@@ -1240,7 +1334,7 @@
           <w:lang w:val="en-IE"/>
         </w:rPr>
         <w:drawing>
-          <wp:inline distT="0" distB="0" distL="0" distR="0" wp14:anchorId="16B32DDF" wp14:editId="6DBF43DF">
+          <wp:inline distT="0" distB="0" distL="0" distR="0" wp14:anchorId="16B32DDF" wp14:editId="1246A8EA">
             <wp:extent cx="4531094" cy="3328168"/>
             <wp:effectExtent l="0" t="0" r="3175" b="5715"/>
             <wp:docPr id="948671269" name="Imagen 2"/>
@@ -1299,24 +1393,14 @@
       <w:r>
         <w:t xml:space="preserve">Figure </w:t>
       </w:r>
-      <w:r>
-        <w:fldChar w:fldCharType="begin"/>
-      </w:r>
-      <w:r>
-        <w:instrText xml:space="preserve"> SEQ Figure \* ARABIC </w:instrText>
-      </w:r>
-      <w:r>
-        <w:fldChar w:fldCharType="separate"/>
-      </w:r>
-      <w:r>
-        <w:rPr>
-          <w:noProof/>
-        </w:rPr>
-        <w:t>2</w:t>
-      </w:r>
-      <w:r>
-        <w:fldChar w:fldCharType="end"/>
-      </w:r>
+      <w:fldSimple w:instr=" SEQ Figure \* ARABIC ">
+        <w:r>
+          <w:rPr>
+            <w:noProof/>
+          </w:rPr>
+          <w:t>2</w:t>
+        </w:r>
+      </w:fldSimple>
       <w:r>
         <w:t>: Waveform verified in the Oscilloscope</w:t>
       </w:r>
@@ -1400,6 +1484,7 @@
       </w:pPr>
       <w:r>
         <w:rPr>
+          <w:noProof/>
           <w:lang w:val="en-IE"/>
         </w:rPr>
         <w:drawing>
@@ -1459,24 +1544,14 @@
       <w:r>
         <w:t xml:space="preserve">Figure </w:t>
       </w:r>
-      <w:r>
-        <w:fldChar w:fldCharType="begin"/>
-      </w:r>
-      <w:r>
-        <w:instrText xml:space="preserve"> SEQ Figure \* ARABIC </w:instrText>
-      </w:r>
-      <w:r>
-        <w:fldChar w:fldCharType="separate"/>
-      </w:r>
-      <w:r>
-        <w:rPr>
-          <w:noProof/>
-        </w:rPr>
-        <w:t>3</w:t>
-      </w:r>
-      <w:r>
-        <w:fldChar w:fldCharType="end"/>
-      </w:r>
+      <w:fldSimple w:instr=" SEQ Figure \* ARABIC ">
+        <w:r>
+          <w:rPr>
+            <w:noProof/>
+          </w:rPr>
+          <w:t>3</w:t>
+        </w:r>
+      </w:fldSimple>
       <w:r>
         <w:t>: Code in Code</w:t>
       </w:r>
@@ -1569,7 +1644,7 @@
           <w:lang w:val="en-IE"/>
         </w:rPr>
         <w:drawing>
-          <wp:inline distT="0" distB="0" distL="0" distR="0" wp14:anchorId="040A22AB" wp14:editId="2FFF5608">
+          <wp:inline distT="0" distB="0" distL="0" distR="0" wp14:anchorId="040A22AB" wp14:editId="31EDFE6F">
             <wp:extent cx="3962400" cy="4535631"/>
             <wp:effectExtent l="0" t="0" r="0" b="0"/>
             <wp:docPr id="2078802847" name="Imagen 1"/>
@@ -1631,24 +1706,14 @@
       <w:r>
         <w:t xml:space="preserve">Figure </w:t>
       </w:r>
-      <w:r>
-        <w:fldChar w:fldCharType="begin"/>
-      </w:r>
-      <w:r>
-        <w:instrText xml:space="preserve"> SEQ Figure \* ARABIC </w:instrText>
-      </w:r>
-      <w:r>
-        <w:fldChar w:fldCharType="separate"/>
-      </w:r>
-      <w:r>
-        <w:rPr>
-          <w:noProof/>
-        </w:rPr>
-        <w:t>4</w:t>
-      </w:r>
-      <w:r>
-        <w:fldChar w:fldCharType="end"/>
-      </w:r>
+      <w:fldSimple w:instr=" SEQ Figure \* ARABIC ">
+        <w:r>
+          <w:rPr>
+            <w:noProof/>
+          </w:rPr>
+          <w:t>4</w:t>
+        </w:r>
+      </w:fldSimple>
       <w:r>
         <w:t>: Calculation of theorical values</w:t>
       </w:r>
@@ -1842,24 +1907,14 @@
       <w:r>
         <w:t xml:space="preserve">Figure </w:t>
       </w:r>
-      <w:r>
-        <w:fldChar w:fldCharType="begin"/>
-      </w:r>
-      <w:r>
-        <w:instrText xml:space="preserve"> SEQ Figure \* ARABIC </w:instrText>
-      </w:r>
-      <w:r>
-        <w:fldChar w:fldCharType="separate"/>
-      </w:r>
-      <w:r>
-        <w:rPr>
-          <w:noProof/>
-        </w:rPr>
-        <w:t>5</w:t>
-      </w:r>
-      <w:r>
-        <w:fldChar w:fldCharType="end"/>
-      </w:r>
+      <w:fldSimple w:instr=" SEQ Figure \* ARABIC ">
+        <w:r>
+          <w:rPr>
+            <w:noProof/>
+          </w:rPr>
+          <w:t>5</w:t>
+        </w:r>
+      </w:fldSimple>
       <w:r>
         <w:t>: Measure of P1.0 with 3.3V in P1.4</w:t>
       </w:r>
@@ -1885,7 +1940,7 @@
     </w:p>
     <w:p>
       <w:r>
-        <w:t>The final phase of the practical involved converting the digital signal back into an analogue waveform that resembled the original input. To achieve this Digital-to-Analogue Conversion (DAC), a 4-channel summing amplifier circuit was constructed on a breadboard.</w:t>
+        <w:t>In the final part of the practical, the digital data had to be turned back into an analogue waveform like the original input. A 4-channel summing amplifier was set up on a breadboard with UA741 op-amps to act as the DAC.</w:t>
       </w:r>
     </w:p>
     <w:p/>
@@ -1945,14 +2000,23 @@
       <w:pPr>
         <w:pStyle w:val="Descripcin"/>
         <w:jc w:val="center"/>
-      </w:pPr>
-      <w:r>
+        <w:rPr>
+          <w:lang w:val="es-ES"/>
+        </w:rPr>
+      </w:pPr>
+      <w:r>
+        <w:rPr>
+          <w:lang w:val="es-ES"/>
+        </w:rPr>
         <w:t xml:space="preserve">Figure </w:t>
       </w:r>
       <w:r>
         <w:fldChar w:fldCharType="begin"/>
       </w:r>
       <w:r>
+        <w:rPr>
+          <w:lang w:val="es-ES"/>
+        </w:rPr>
         <w:instrText xml:space="preserve"> SEQ Figure \* ARABIC </w:instrText>
       </w:r>
       <w:r>
@@ -1961,6 +2025,7 @@
       <w:r>
         <w:rPr>
           <w:noProof/>
+          <w:lang w:val="es-ES"/>
         </w:rPr>
         <w:t>6</w:t>
       </w:r>
@@ -1968,80 +2033,68 @@
         <w:fldChar w:fldCharType="end"/>
       </w:r>
       <w:r>
+        <w:rPr>
+          <w:lang w:val="es-ES"/>
+        </w:rPr>
         <w:t>: Summing Amplifier</w:t>
       </w:r>
     </w:p>
     <w:p>
       <w:pPr>
-        <w:rPr>
-          <w:lang w:val="es-ES"/>
-        </w:rPr>
-      </w:pPr>
-      <w:r>
-        <w:rPr>
-          <w:lang w:val="es-ES"/>
-        </w:rPr>
-        <w:t xml:space="preserve">La fase final de la práctica consistió en convertir la señal digital de vuelta a una forma de onda analógica que se asemejara a la entrada original. Para lograr esta conversión digital a analógica (DAC), se construyó un circuito amplificador </w:t>
-      </w:r>
-      <w:r>
-        <w:rPr>
-          <w:lang w:val="es-ES"/>
-        </w:rPr>
+        <w:keepNext/>
+      </w:pPr>
+      <w:r>
+        <w:t>During testing</w:t>
+      </w:r>
+      <w:r>
+        <w:t xml:space="preserve">, </w:t>
+      </w:r>
+      <w:r>
+        <w:t xml:space="preserve">the reconstructed signal was </w:t>
+      </w:r>
+      <w:r>
+        <w:t>tested</w:t>
+      </w:r>
+      <w:r>
+        <w:t xml:space="preserve"> on the oscilloscope, as seen in Figure 7. While the wave clearly had the staircase look typical of quantisation</w:t>
+      </w:r>
+      <w:r>
+        <w:t xml:space="preserve">, </w:t>
+      </w:r>
+      <w:r>
+        <w:t xml:space="preserve">confirming the circuit's basic </w:t>
+      </w:r>
+      <w:r>
+        <w:t xml:space="preserve">operation, </w:t>
+      </w:r>
+      <w:r>
+        <w:t xml:space="preserve">it was missing the full 16 voltage steps of a 4-bit setup. Instead, the voltage jumps were quite large and there were </w:t>
+      </w:r>
+      <w:r>
         <w:lastRenderedPageBreak/>
-        <w:t xml:space="preserve">sumador de 4 canales utilizando operacionales UA741 en una protoboard. Durante la fase de pruebas, la señal analógica reconstruida se capturó con el osciloscopio (ver Figura </w:t>
-      </w:r>
-      <w:r>
-        <w:rPr>
-          <w:lang w:val="es-ES"/>
-        </w:rPr>
-        <w:t>7</w:t>
-      </w:r>
-      <w:r>
-        <w:rPr>
-          <w:lang w:val="es-ES"/>
-        </w:rPr>
-        <w:t>). La onda resultante mostró el esperado efecto de cuantización en forma de escalera, validando el principio fundamental de la conversión. Sin embargo, la señal no exhibió los 16 niveles discretos de voltaje que corresponden a la resolución de 4 bits del sistema. En su lugar, se observó una forma de onda con escalones significativamente más grandes y una menor cantidad total de niveles. Esta limitación se atribuye a dos posibles fuentes de error experimentales</w:t>
-      </w:r>
-      <w:r>
-        <w:rPr>
-          <w:lang w:val="es-ES"/>
-        </w:rPr>
-        <w:t>,</w:t>
-      </w:r>
-      <w:r>
-        <w:rPr>
-          <w:lang w:val="es-ES"/>
-        </w:rPr>
-        <w:t xml:space="preserve"> </w:t>
-      </w:r>
-      <w:r>
-        <w:rPr>
-          <w:lang w:val="es-ES"/>
-        </w:rPr>
-        <w:t>una amplitud insuficiente en la señal analógica de entrada que no logró abarcar el rango dinámico completo de 0 a 3V del ADC, o un fallo de conexión física en la protoboard (como un mal contacto en el pin del bit menos significativo, LSB), lo cual habría forzado al DAC a operar con una resolución efectiva inferior, similar a un sistema de 3 bits u 8 niveles.</w:t>
-      </w:r>
-    </w:p>
-    <w:p>
-      <w:pPr>
-        <w:rPr>
-          <w:lang w:val="es-ES"/>
-        </w:rPr>
-      </w:pPr>
+        <w:t>noticeably fewer steps. A poor physical connection in the breadboard, or perhaps a damaged component, probably caused this drop in resolution, making the DAC behave more like a 3-bit (8-level) system.</w:t>
+      </w:r>
     </w:p>
     <w:p>
       <w:pPr>
         <w:keepNext/>
         <w:jc w:val="center"/>
       </w:pPr>
+    </w:p>
+    <w:p>
+      <w:pPr>
+        <w:keepNext/>
+        <w:jc w:val="center"/>
+      </w:pPr>
       <w:r>
         <w:rPr>
           <w:noProof/>
           <w:lang w:val="es-ES"/>
         </w:rPr>
         <w:drawing>
-          <wp:inline distT="0" distB="0" distL="0" distR="0" wp14:anchorId="0C55DD63" wp14:editId="28AADBE2">
-            <wp:extent cx="5485130" cy="3733517"/>
-            <wp:effectExtent l="0" t="0" r="1270" b="635"/>
+          <wp:inline distT="0" distB="0" distL="0" distR="0" wp14:anchorId="0C55DD63" wp14:editId="0974CD23">
+            <wp:extent cx="4518705" cy="3075709"/>
+            <wp:effectExtent l="0" t="0" r="0" b="0"/>
             <wp:docPr id="1299820759" name="Imagen 4"/>
             <wp:cNvGraphicFramePr>
               <a:graphicFrameLocks xmlns:a="http://schemas.openxmlformats.org/drawingml/2006/main" noChangeAspect="1"/>
@@ -2069,7 +2122,7 @@
                   <pic:spPr bwMode="auto">
                     <a:xfrm>
                       <a:off x="0" y="0"/>
-                      <a:ext cx="5486400" cy="3734381"/>
+                      <a:ext cx="4549248" cy="3096499"/>
                     </a:xfrm>
                     <a:prstGeom prst="rect">
                       <a:avLst/>
@@ -2099,12 +2152,18 @@
         </w:rPr>
       </w:pPr>
       <w:r>
+        <w:rPr>
+          <w:lang w:val="es-ES"/>
+        </w:rPr>
         <w:t xml:space="preserve">Figure </w:t>
       </w:r>
       <w:r>
         <w:fldChar w:fldCharType="begin"/>
       </w:r>
       <w:r>
+        <w:rPr>
+          <w:lang w:val="es-ES"/>
+        </w:rPr>
         <w:instrText xml:space="preserve"> SEQ Figure \* ARABIC </w:instrText>
       </w:r>
       <w:r>
@@ -2113,6 +2172,7 @@
       <w:r>
         <w:rPr>
           <w:noProof/>
+          <w:lang w:val="es-ES"/>
         </w:rPr>
         <w:t>7</w:t>
       </w:r>
@@ -2120,32 +2180,96 @@
         <w:fldChar w:fldCharType="end"/>
       </w:r>
       <w:r>
+        <w:rPr>
+          <w:lang w:val="es-ES"/>
+        </w:rPr>
         <w:t>: Reconstructed Signal</w:t>
       </w:r>
     </w:p>
     <w:p>
       <w:pPr>
-        <w:rPr>
-          <w:lang w:val="es-ES"/>
-        </w:rPr>
-      </w:pPr>
-      <w:r>
-        <w:rPr>
-          <w:lang w:val="es-ES"/>
-        </w:rPr>
-        <w:t xml:space="preserve">PARTE 4. DIBUJAR COMO SE VERIA CON LOS 16 NIVELES. Y EXPLICAR QUE LA RAZON PRINICIPAL POR LA QUE NO FUNCIONA ES POR UN MAL CABLEADO DENTRO DE </w:t>
-      </w:r>
-      <w:r>
-        <w:rPr>
-          <w:lang w:val="es-ES"/>
-        </w:rPr>
-        <w:t>LA BREADBOARD</w:t>
-      </w:r>
-    </w:p>
-    <w:p>
-      <w:pPr>
-        <w:rPr>
-          <w:lang w:val="es-ES"/>
+        <w:keepNext/>
+        <w:jc w:val="center"/>
+      </w:pPr>
+      <w:r>
+        <w:rPr>
+          <w:noProof/>
+          <w:lang w:val="en-GB"/>
+        </w:rPr>
+        <w:drawing>
+          <wp:inline distT="0" distB="0" distL="0" distR="0" wp14:anchorId="098593C3" wp14:editId="1BFB0ED5">
+            <wp:extent cx="3164999" cy="4557144"/>
+            <wp:effectExtent l="8890" t="0" r="6350" b="6350"/>
+            <wp:docPr id="893819255" name="Imagen 1"/>
+            <wp:cNvGraphicFramePr>
+              <a:graphicFrameLocks xmlns:a="http://schemas.openxmlformats.org/drawingml/2006/main" noChangeAspect="1"/>
+            </wp:cNvGraphicFramePr>
+            <a:graphic xmlns:a="http://schemas.openxmlformats.org/drawingml/2006/main">
+              <a:graphicData uri="http://schemas.openxmlformats.org/drawingml/2006/picture">
+                <pic:pic xmlns:pic="http://schemas.openxmlformats.org/drawingml/2006/picture">
+                  <pic:nvPicPr>
+                    <pic:cNvPr id="893819255" name="Imagen 893819255"/>
+                    <pic:cNvPicPr/>
+                  </pic:nvPicPr>
+                  <pic:blipFill rotWithShape="1">
+                    <a:blip r:embed="rId16" cstate="print">
+                      <a:extLst>
+                        <a:ext uri="{28A0092B-C50C-407E-A947-70E740481C1C}">
+                          <a14:useLocalDpi xmlns:a14="http://schemas.microsoft.com/office/drawing/2010/main" val="0"/>
+                        </a:ext>
+                      </a:extLst>
+                    </a:blip>
+                    <a:srcRect l="10695" t="12863" r="11944" b="3269"/>
+                    <a:stretch>
+                      <a:fillRect/>
+                    </a:stretch>
+                  </pic:blipFill>
+                  <pic:spPr bwMode="auto">
+                    <a:xfrm rot="16200000">
+                      <a:off x="0" y="0"/>
+                      <a:ext cx="3178525" cy="4576620"/>
+                    </a:xfrm>
+                    <a:prstGeom prst="rect">
+                      <a:avLst/>
+                    </a:prstGeom>
+                    <a:ln>
+                      <a:noFill/>
+                    </a:ln>
+                    <a:extLst>
+                      <a:ext uri="{53640926-AAD7-44D8-BBD7-CCE9431645EC}">
+                        <a14:shadowObscured xmlns:a14="http://schemas.microsoft.com/office/drawing/2010/main"/>
+                      </a:ext>
+                    </a:extLst>
+                  </pic:spPr>
+                </pic:pic>
+              </a:graphicData>
+            </a:graphic>
+          </wp:inline>
+        </w:drawing>
+      </w:r>
+    </w:p>
+    <w:p>
+      <w:pPr>
+        <w:pStyle w:val="Descripcin"/>
+        <w:jc w:val="center"/>
+      </w:pPr>
+      <w:r>
+        <w:t xml:space="preserve">Figure </w:t>
+      </w:r>
+      <w:r>
+        <w:t>8</w:t>
+      </w:r>
+      <w:r>
+        <w:t>: Quantized 4-bit PCM Signal draw</w:t>
+      </w:r>
+      <w:r>
+        <w:t>n</w:t>
+      </w:r>
+    </w:p>
+    <w:p>
+      <w:pPr>
+        <w:rPr>
+          <w:lang w:val="en-GB"/>
         </w:rPr>
       </w:pPr>
     </w:p>
@@ -2160,6 +2284,7 @@
         <w:rPr>
           <w:lang w:val="en-IE"/>
         </w:rPr>
+        <w:lastRenderedPageBreak/>
         <w:t xml:space="preserve">5. </w:t>
       </w:r>
       <w:r>
@@ -2588,7 +2713,7 @@
             <wp:cNvGraphicFramePr/>
             <a:graphic xmlns:a="http://schemas.openxmlformats.org/drawingml/2006/main">
               <a:graphicData uri="http://schemas.openxmlformats.org/drawingml/2006/chart">
-                <c:chart xmlns:c="http://schemas.openxmlformats.org/drawingml/2006/chart" xmlns:r="http://schemas.openxmlformats.org/officeDocument/2006/relationships" r:id="rId16"/>
+                <c:chart xmlns:c="http://schemas.openxmlformats.org/drawingml/2006/chart" xmlns:r="http://schemas.openxmlformats.org/officeDocument/2006/relationships" r:id="rId17"/>
               </a:graphicData>
             </a:graphic>
           </wp:inline>
@@ -2699,7 +2824,14 @@
         <w:rPr>
           <w:rFonts w:cs="Arial"/>
         </w:rPr>
-        <w:t xml:space="preserve">The objective of a laboratory report is to communicate the details of a piece of work to a third party, in such a way that should they wish, they could repeat and verify your work. It is the task of the report writer to structure the information into a format appropriate to the target audience. The </w:t>
+        <w:t xml:space="preserve">The objective of a laboratory report is to communicate the details of a piece of work to a third party, in such a way that should they wish, they could repeat and </w:t>
+      </w:r>
+      <w:r>
+        <w:rPr>
+          <w:rFonts w:cs="Arial"/>
+        </w:rPr>
+        <w:lastRenderedPageBreak/>
+        <w:t xml:space="preserve">verify your work. It is the task of the report writer to structure the information into a format appropriate to the target audience. The </w:t>
       </w:r>
       <w:r>
         <w:rPr>
@@ -3115,7 +3247,7 @@
           <w:rFonts w:ascii="Trebuchet MS" w:hAnsi="Trebuchet MS"/>
         </w:rPr>
         <w:sectPr>
-          <w:footerReference w:type="default" r:id="rId17"/>
+          <w:footerReference w:type="default" r:id="rId18"/>
           <w:pgSz w:w="12240" w:h="15840"/>
           <w:pgMar w:top="1440" w:right="1800" w:bottom="1440" w:left="1800" w:header="708" w:footer="708" w:gutter="0"/>
           <w:cols w:space="708"/>

</xml_diff>